<commit_message>
Relatório de conformidade em visual sóbrio
Co-Authored-By: Claude Sonnet 5.5 <noreply@anthropic.com>
</commit_message>
<xml_diff>
--- a/decks/curso-ia-aula2/material/kit_fonte/relatorio-exemplo.docx
+++ b/decks/curso-ia-aula2/material/kit_fonte/relatorio-exemplo.docx
@@ -2,272 +2,38 @@
 <file path=word/document.xml><?xml version="1.0" encoding="utf-8"?>
 <w:document xmlns:wpc="http://schemas.microsoft.com/office/word/2010/wordprocessingCanvas" xmlns:mo="http://schemas.microsoft.com/office/mac/office/2008/main" xmlns:mc="http://schemas.openxmlformats.org/markup-compatibility/2006" xmlns:mv="urn:schemas-microsoft-com:mac:vml" xmlns:o="urn:schemas-microsoft-com:office:office" xmlns:r="http://schemas.openxmlformats.org/officeDocument/2006/relationships" xmlns:m="http://schemas.openxmlformats.org/officeDocument/2006/math" xmlns:v="urn:schemas-microsoft-com:vml" xmlns:wp14="http://schemas.microsoft.com/office/word/2010/wordprocessingDrawing" xmlns:wp="http://schemas.openxmlformats.org/drawingml/2006/wordprocessingDrawing" xmlns:w10="urn:schemas-microsoft-com:office:word" xmlns:w="http://schemas.openxmlformats.org/wordprocessingml/2006/main" xmlns:w14="http://schemas.microsoft.com/office/word/2010/wordml" xmlns:wpg="http://schemas.microsoft.com/office/word/2010/wordprocessingGroup" xmlns:wpi="http://schemas.microsoft.com/office/word/2010/wordprocessingInk" xmlns:wne="http://schemas.microsoft.com/office/word/2006/wordml" xmlns:wps="http://schemas.microsoft.com/office/word/2010/wordprocessingShape" mc:Ignorable="w14 wp14">
   <w:body>
-    <w:tbl>
-      <w:tblPr>
-        <w:jc w:val="center"/>
-        <w:tblLook w:firstColumn="1" w:firstRow="1" w:lastColumn="0" w:lastRow="0" w:noHBand="0" w:noVBand="1" w:val="04A0"/>
-        <w:tblW w:w="9355" w:type="dxa"/>
-        <w:tblLayout w:type="fixed"/>
-      </w:tblPr>
-      <w:tblGrid>
-        <w:gridCol w:w="9354"/>
-      </w:tblGrid>
-      <w:tr>
-        <w:tc>
-          <w:tcPr>
-            <w:tcW w:type="dxa" w:w="9354"/>
-            <w:shd w:val="clear" w:color="auto" w:fill="064A45"/>
-            <w:tcMar>
-              <w:top w:w="220" w:type="dxa"/>
-              <w:start w:w="280" w:type="dxa"/>
-              <w:bottom w:w="220" w:type="dxa"/>
-              <w:end w:w="280" w:type="dxa"/>
-            </w:tcMar>
-            <w:tcBorders>
-              <w:top w:val="nil"/>
-              <w:left w:val="nil"/>
-              <w:bottom w:val="single" w:sz="36" w:color="B87548"/>
-              <w:right w:val="nil"/>
-            </w:tcBorders>
-          </w:tcPr>
-          <w:p>
-            <w:r>
-              <w:rPr>
-                <w:rFonts w:ascii="Georgia" w:hAnsi="Georgia" w:eastAsia="Georgia"/>
-                <w:b/>
-                <w:i w:val="0"/>
-                <w:color w:val="E8C9A8"/>
-                <w:sz w:val="19"/>
-              </w:rPr>
-              <w:t>RELATÓRIO DE CONFORMIDADE</w:t>
-            </w:r>
-          </w:p>
-          <w:p>
-            <w:r>
-              <w:rPr>
-                <w:rFonts w:ascii="Georgia" w:hAnsi="Georgia" w:eastAsia="Georgia"/>
-                <w:b/>
-                <w:i w:val="0"/>
-                <w:color w:val="FFFFFF"/>
-                <w:sz w:val="44"/>
-              </w:rPr>
-              <w:t>Temas 6 e 1234 do STF</w:t>
-            </w:r>
-          </w:p>
-          <w:p>
-            <w:r>
-              <w:rPr>
-                <w:rFonts w:ascii="Georgia" w:hAnsi="Georgia" w:eastAsia="Georgia"/>
-                <w:b w:val="0"/>
-                <w:i/>
-                <w:color w:val="FFFFFF"/>
-                <w:sz w:val="23"/>
-              </w:rPr>
-              <w:t>Fornecimento de medicamento X (caso fictício)</w:t>
-            </w:r>
-          </w:p>
-        </w:tc>
-      </w:tr>
-    </w:tbl>
     <w:p>
       <w:pPr>
-        <w:spacing w:after="0"/>
+        <w:spacing w:before="120" w:after="40"/>
       </w:pPr>
+      <w:r>
+        <w:rPr>
+          <w:rFonts w:ascii="Georgia" w:hAnsi="Georgia" w:eastAsia="Georgia"/>
+          <w:b/>
+          <w:i w:val="0"/>
+          <w:color w:val="064A45"/>
+          <w:sz w:val="40"/>
+        </w:rPr>
+        <w:t>Relatório de conformidade</w:t>
+      </w:r>
     </w:p>
-    <w:tbl>
-      <w:tblPr>
-        <w:tblLook w:firstColumn="1" w:firstRow="1" w:lastColumn="0" w:lastRow="0" w:noHBand="0" w:noVBand="1" w:val="04A0"/>
-        <w:tblW w:w="9355" w:type="dxa"/>
-        <w:tblLayout w:type="fixed"/>
-      </w:tblPr>
-      <w:tblGrid>
-        <w:gridCol w:w="3118"/>
-        <w:gridCol w:w="3118"/>
-        <w:gridCol w:w="3118"/>
-      </w:tblGrid>
-      <w:tr>
-        <w:tc>
-          <w:tcPr>
-            <w:tcW w:type="dxa" w:w="3118"/>
-            <w:tcMar>
-              <w:top w:w="30" w:type="dxa"/>
-              <w:start w:w="60" w:type="dxa"/>
-              <w:bottom w:w="30" w:type="dxa"/>
-              <w:end w:w="60" w:type="dxa"/>
-            </w:tcMar>
-            <w:tcBorders>
-              <w:top w:val="nil"/>
-              <w:left w:val="nil"/>
-              <w:bottom w:val="nil"/>
-              <w:right w:val="nil"/>
-            </w:tcBorders>
-          </w:tcPr>
-          <w:p>
-            <w:r>
-              <w:rPr>
-                <w:rFonts w:ascii="Georgia" w:hAnsi="Georgia" w:eastAsia="Georgia"/>
-                <w:b/>
-                <w:i w:val="0"/>
-                <w:color w:val="B87548"/>
-                <w:sz w:val="16"/>
-              </w:rPr>
-              <w:t>PROCESSO</w:t>
-            </w:r>
-          </w:p>
-        </w:tc>
-        <w:tc>
-          <w:tcPr>
-            <w:tcW w:type="dxa" w:w="3118"/>
-            <w:tcMar>
-              <w:top w:w="30" w:type="dxa"/>
-              <w:start w:w="60" w:type="dxa"/>
-              <w:bottom w:w="30" w:type="dxa"/>
-              <w:end w:w="60" w:type="dxa"/>
-            </w:tcMar>
-            <w:tcBorders>
-              <w:top w:val="nil"/>
-              <w:left w:val="nil"/>
-              <w:bottom w:val="nil"/>
-              <w:right w:val="nil"/>
-            </w:tcBorders>
-          </w:tcPr>
-          <w:p>
-            <w:r>
-              <w:rPr>
-                <w:rFonts w:ascii="Georgia" w:hAnsi="Georgia" w:eastAsia="Georgia"/>
-                <w:b/>
-                <w:i w:val="0"/>
-                <w:color w:val="B87548"/>
-                <w:sz w:val="16"/>
-              </w:rPr>
-              <w:t>AUTOR REPRESENTADO POR</w:t>
-            </w:r>
-          </w:p>
-        </w:tc>
-        <w:tc>
-          <w:tcPr>
-            <w:tcW w:type="dxa" w:w="3118"/>
-            <w:tcMar>
-              <w:top w:w="30" w:type="dxa"/>
-              <w:start w:w="60" w:type="dxa"/>
-              <w:bottom w:w="30" w:type="dxa"/>
-              <w:end w:w="60" w:type="dxa"/>
-            </w:tcMar>
-            <w:tcBorders>
-              <w:top w:val="nil"/>
-              <w:left w:val="nil"/>
-              <w:bottom w:val="nil"/>
-              <w:right w:val="nil"/>
-            </w:tcBorders>
-          </w:tcPr>
-          <w:p>
-            <w:r>
-              <w:rPr>
-                <w:rFonts w:ascii="Georgia" w:hAnsi="Georgia" w:eastAsia="Georgia"/>
-                <w:b/>
-                <w:i w:val="0"/>
-                <w:color w:val="B87548"/>
-                <w:sz w:val="16"/>
-              </w:rPr>
-              <w:t>DATA DA ANÁLISE</w:t>
-            </w:r>
-          </w:p>
-        </w:tc>
-      </w:tr>
-      <w:tr>
-        <w:tc>
-          <w:tcPr>
-            <w:tcW w:type="dxa" w:w="3118"/>
-            <w:tcMar>
-              <w:top w:w="30" w:type="dxa"/>
-              <w:start w:w="60" w:type="dxa"/>
-              <w:bottom w:w="30" w:type="dxa"/>
-              <w:end w:w="60" w:type="dxa"/>
-            </w:tcMar>
-            <w:tcBorders>
-              <w:top w:val="nil"/>
-              <w:left w:val="nil"/>
-              <w:bottom w:val="nil"/>
-              <w:right w:val="nil"/>
-            </w:tcBorders>
-          </w:tcPr>
-          <w:p>
-            <w:r>
-              <w:rPr>
-                <w:rFonts w:ascii="Georgia" w:hAnsi="Georgia" w:eastAsia="Georgia"/>
-                <w:b/>
-                <w:i w:val="0"/>
-                <w:color w:val="064A45"/>
-                <w:sz w:val="22"/>
-              </w:rPr>
-              <w:t>0000000-00.2025.8.12.0000 (fictício)</w:t>
-            </w:r>
-          </w:p>
-        </w:tc>
-        <w:tc>
-          <w:tcPr>
-            <w:tcW w:type="dxa" w:w="3118"/>
-            <w:tcMar>
-              <w:top w:w="30" w:type="dxa"/>
-              <w:start w:w="60" w:type="dxa"/>
-              <w:bottom w:w="30" w:type="dxa"/>
-              <w:end w:w="60" w:type="dxa"/>
-            </w:tcMar>
-            <w:tcBorders>
-              <w:top w:val="nil"/>
-              <w:left w:val="nil"/>
-              <w:bottom w:val="nil"/>
-              <w:right w:val="nil"/>
-            </w:tcBorders>
-          </w:tcPr>
-          <w:p>
-            <w:r>
-              <w:rPr>
-                <w:rFonts w:ascii="Georgia" w:hAnsi="Georgia" w:eastAsia="Georgia"/>
-                <w:b/>
-                <w:i w:val="0"/>
-                <w:color w:val="064A45"/>
-                <w:sz w:val="22"/>
-              </w:rPr>
-              <w:t>Advogado particular</w:t>
-            </w:r>
-          </w:p>
-        </w:tc>
-        <w:tc>
-          <w:tcPr>
-            <w:tcW w:type="dxa" w:w="3118"/>
-            <w:tcMar>
-              <w:top w:w="30" w:type="dxa"/>
-              <w:start w:w="60" w:type="dxa"/>
-              <w:bottom w:w="30" w:type="dxa"/>
-              <w:end w:w="60" w:type="dxa"/>
-            </w:tcMar>
-            <w:tcBorders>
-              <w:top w:val="nil"/>
-              <w:left w:val="nil"/>
-              <w:bottom w:val="nil"/>
-              <w:right w:val="nil"/>
-            </w:tcBorders>
-          </w:tcPr>
-          <w:p>
-            <w:r>
-              <w:rPr>
-                <w:rFonts w:ascii="Georgia" w:hAnsi="Georgia" w:eastAsia="Georgia"/>
-                <w:b/>
-                <w:i w:val="0"/>
-                <w:color w:val="064A45"/>
-                <w:sz w:val="22"/>
-              </w:rPr>
-              <w:t>23/10/2026</w:t>
-            </w:r>
-          </w:p>
-        </w:tc>
-      </w:tr>
-    </w:tbl>
     <w:p>
       <w:pPr>
-        <w:spacing w:after="0"/>
+        <w:spacing w:after="200"/>
+        <w:pBdr>
+          <w:bottom w:val="single" w:sz="8" w:space="8" w:color="B87548"/>
+        </w:pBdr>
       </w:pPr>
+      <w:r>
+        <w:rPr>
+          <w:rFonts w:ascii="Georgia" w:hAnsi="Georgia" w:eastAsia="Georgia"/>
+          <w:b w:val="0"/>
+          <w:i/>
+          <w:color w:val="666666"/>
+          <w:sz w:val="22"/>
+        </w:rPr>
+        <w:t>Temas 6 e 1234 do STF · fornecimento de medicamento X (caso fictício)</w:t>
+      </w:r>
     </w:p>
     <w:tbl>
       <w:tblPr>
@@ -282,64 +48,48 @@
       <w:tr>
         <w:tc>
           <w:tcPr>
-            <w:tcW w:type="dxa" w:w="2381"/>
-            <w:shd w:val="clear" w:color="auto" w:fill="B3402F"/>
-            <w:vAlign w:val="center"/>
+            <w:tcW w:type="dxa" w:w="2835"/>
             <w:tcMar>
-              <w:top w:w="140" w:type="dxa"/>
-              <w:start w:w="120" w:type="dxa"/>
-              <w:bottom w:w="140" w:type="dxa"/>
-              <w:end w:w="120" w:type="dxa"/>
+              <w:top w:w="50" w:type="dxa"/>
+              <w:start w:w="0" w:type="dxa"/>
+              <w:bottom w:w="50" w:type="dxa"/>
+              <w:end w:w="0" w:type="dxa"/>
             </w:tcMar>
+            <w:tcBorders>
+              <w:top w:val="nil"/>
+              <w:left w:val="nil"/>
+              <w:bottom w:val="single" w:sz="4" w:color="D9D9D9"/>
+              <w:right w:val="nil"/>
+            </w:tcBorders>
           </w:tcPr>
           <w:p>
-            <w:pPr>
-              <w:jc w:val="center"/>
-            </w:pPr>
-            <w:r>
-              <w:rPr>
-                <w:rFonts w:ascii="Georgia" w:hAnsi="Georgia" w:eastAsia="Georgia"/>
-                <w:b/>
-                <w:i w:val="0"/>
-                <w:color w:val="FFFFFF"/>
-                <w:sz w:val="60"/>
-              </w:rPr>
-              <w:t>2/6</w:t>
-            </w:r>
-          </w:p>
-          <w:p>
-            <w:pPr>
-              <w:jc w:val="center"/>
-            </w:pPr>
             <w:r>
               <w:rPr>
                 <w:rFonts w:ascii="Georgia" w:hAnsi="Georgia" w:eastAsia="Georgia"/>
                 <w:b w:val="0"/>
                 <w:i w:val="0"/>
-                <w:color w:val="FFFFFF"/>
-                <w:sz w:val="19"/>
+                <w:color w:val="666666"/>
+                <w:sz w:val="20"/>
               </w:rPr>
-              <w:t>requisitos</w:t>
+              <w:t>Processo</w:t>
             </w:r>
           </w:p>
         </w:tc>
         <w:tc>
           <w:tcPr>
-            <w:tcW w:type="dxa" w:w="6973"/>
-            <w:shd w:val="clear" w:color="auto" w:fill="F6EFE8"/>
+            <w:tcW w:type="dxa" w:w="6520"/>
             <w:tcMar>
-              <w:top w:w="140" w:type="dxa"/>
-              <w:start w:w="220" w:type="dxa"/>
-              <w:bottom w:w="140" w:type="dxa"/>
-              <w:end w:w="220" w:type="dxa"/>
+              <w:top w:w="50" w:type="dxa"/>
+              <w:start w:w="0" w:type="dxa"/>
+              <w:bottom w:w="50" w:type="dxa"/>
+              <w:end w:w="0" w:type="dxa"/>
             </w:tcMar>
             <w:tcBorders>
               <w:top w:val="nil"/>
-              <w:left w:val="single" w:sz="36" w:color="B3402F"/>
-              <w:bottom w:val="nil"/>
+              <w:left w:val="nil"/>
+              <w:bottom w:val="single" w:sz="4" w:color="D9D9D9"/>
               <w:right w:val="nil"/>
             </w:tcBorders>
-            <w:vAlign w:val="center"/>
           </w:tcPr>
           <w:p>
             <w:r>
@@ -347,22 +97,127 @@
                 <w:rFonts w:ascii="Georgia" w:hAnsi="Georgia" w:eastAsia="Georgia"/>
                 <w:b/>
                 <w:i w:val="0"/>
-                <w:color w:val="064A45"/>
-                <w:sz w:val="28"/>
+                <w:sz w:val="21"/>
               </w:rPr>
-              <w:t>O autor não cumpriu todos os requisitos.</w:t>
+              <w:t>0000000-00.2025.8.12.0000 (fictício)</w:t>
             </w:r>
           </w:p>
+        </w:tc>
+      </w:tr>
+      <w:tr>
+        <w:tc>
+          <w:tcPr>
+            <w:tcW w:type="dxa" w:w="2835"/>
+            <w:tcMar>
+              <w:top w:w="50" w:type="dxa"/>
+              <w:start w:w="0" w:type="dxa"/>
+              <w:bottom w:w="50" w:type="dxa"/>
+              <w:end w:w="0" w:type="dxa"/>
+            </w:tcMar>
+            <w:tcBorders>
+              <w:top w:val="nil"/>
+              <w:left w:val="nil"/>
+              <w:bottom w:val="single" w:sz="4" w:color="D9D9D9"/>
+              <w:right w:val="nil"/>
+            </w:tcBorders>
+          </w:tcPr>
           <w:p>
             <w:r>
               <w:rPr>
                 <w:rFonts w:ascii="Georgia" w:hAnsi="Georgia" w:eastAsia="Georgia"/>
                 <w:b w:val="0"/>
                 <w:i w:val="0"/>
-                <w:color w:val="333333"/>
+                <w:color w:val="666666"/>
+                <w:sz w:val="20"/>
+              </w:rPr>
+              <w:t>Autor representado por</w:t>
+            </w:r>
+          </w:p>
+        </w:tc>
+        <w:tc>
+          <w:tcPr>
+            <w:tcW w:type="dxa" w:w="6520"/>
+            <w:tcMar>
+              <w:top w:w="50" w:type="dxa"/>
+              <w:start w:w="0" w:type="dxa"/>
+              <w:bottom w:w="50" w:type="dxa"/>
+              <w:end w:w="0" w:type="dxa"/>
+            </w:tcMar>
+            <w:tcBorders>
+              <w:top w:val="nil"/>
+              <w:left w:val="nil"/>
+              <w:bottom w:val="single" w:sz="4" w:color="D9D9D9"/>
+              <w:right w:val="nil"/>
+            </w:tcBorders>
+          </w:tcPr>
+          <w:p>
+            <w:r>
+              <w:rPr>
+                <w:rFonts w:ascii="Georgia" w:hAnsi="Georgia" w:eastAsia="Georgia"/>
+                <w:b/>
+                <w:i w:val="0"/>
                 <w:sz w:val="21"/>
               </w:rPr>
-              <w:t>Faltam a prova da negativa administrativa e a prova da incapacidade financeira. O laudo cita estudos, mas não ensaio clínico randomizado.</w:t>
+              <w:t>Advogado particular</w:t>
+            </w:r>
+          </w:p>
+        </w:tc>
+      </w:tr>
+      <w:tr>
+        <w:tc>
+          <w:tcPr>
+            <w:tcW w:type="dxa" w:w="2835"/>
+            <w:tcMar>
+              <w:top w:w="50" w:type="dxa"/>
+              <w:start w:w="0" w:type="dxa"/>
+              <w:bottom w:w="50" w:type="dxa"/>
+              <w:end w:w="0" w:type="dxa"/>
+            </w:tcMar>
+            <w:tcBorders>
+              <w:top w:val="nil"/>
+              <w:left w:val="nil"/>
+              <w:bottom w:val="single" w:sz="4" w:color="D9D9D9"/>
+              <w:right w:val="nil"/>
+            </w:tcBorders>
+          </w:tcPr>
+          <w:p>
+            <w:r>
+              <w:rPr>
+                <w:rFonts w:ascii="Georgia" w:hAnsi="Georgia" w:eastAsia="Georgia"/>
+                <w:b w:val="0"/>
+                <w:i w:val="0"/>
+                <w:color w:val="666666"/>
+                <w:sz w:val="20"/>
+              </w:rPr>
+              <w:t>Data da análise</w:t>
+            </w:r>
+          </w:p>
+        </w:tc>
+        <w:tc>
+          <w:tcPr>
+            <w:tcW w:type="dxa" w:w="6520"/>
+            <w:tcMar>
+              <w:top w:w="50" w:type="dxa"/>
+              <w:start w:w="0" w:type="dxa"/>
+              <w:bottom w:w="50" w:type="dxa"/>
+              <w:end w:w="0" w:type="dxa"/>
+            </w:tcMar>
+            <w:tcBorders>
+              <w:top w:val="nil"/>
+              <w:left w:val="nil"/>
+              <w:bottom w:val="single" w:sz="4" w:color="D9D9D9"/>
+              <w:right w:val="nil"/>
+            </w:tcBorders>
+          </w:tcPr>
+          <w:p>
+            <w:r>
+              <w:rPr>
+                <w:rFonts w:ascii="Georgia" w:hAnsi="Georgia" w:eastAsia="Georgia"/>
+                <w:b/>
+                <w:i w:val="0"/>
+                <w:sz w:val="21"/>
+              </w:rPr>
+              <w:t>23/10/2026</w:t>
             </w:r>
           </w:p>
         </w:tc>
@@ -370,10 +225,7 @@
     </w:tbl>
     <w:p>
       <w:pPr>
-        <w:spacing w:before="320" w:after="120"/>
-        <w:pBdr>
-          <w:bottom w:val="single" w:sz="12" w:space="4" w:color="B87548"/>
-        </w:pBdr>
+        <w:spacing w:before="360" w:after="120"/>
       </w:pPr>
       <w:r>
         <w:rPr>
@@ -381,425 +233,57 @@
           <w:b/>
           <w:i w:val="0"/>
           <w:color w:val="064A45"/>
-          <w:sz w:val="25"/>
+          <w:sz w:val="24"/>
         </w:rPr>
-        <w:t>Tema 6: os seis requisitos</w:t>
+        <w:t>Conclusão</w:t>
       </w:r>
     </w:p>
-    <w:tbl>
-      <w:tblPr>
-        <w:tblLook w:firstColumn="1" w:firstRow="1" w:lastColumn="0" w:lastRow="0" w:noHBand="0" w:noVBand="1" w:val="04A0"/>
-        <w:tblW w:w="9355" w:type="dxa"/>
-        <w:jc w:val="center"/>
-        <w:tblLayout w:type="fixed"/>
-      </w:tblPr>
-      <w:tblGrid>
-        <w:gridCol w:w="1559"/>
-        <w:gridCol w:w="1559"/>
-        <w:gridCol w:w="1559"/>
-        <w:gridCol w:w="1559"/>
-        <w:gridCol w:w="1559"/>
-        <w:gridCol w:w="1559"/>
-      </w:tblGrid>
-      <w:tr>
-        <w:tc>
-          <w:tcPr>
-            <w:tcW w:type="dxa" w:w="1559"/>
-            <w:shd w:val="clear" w:color="auto" w:fill="C98A0B"/>
-            <w:tcBorders>
-              <w:top w:val="nil"/>
-              <w:left w:val="single" w:sz="24" w:color="FFFFFF"/>
-              <w:bottom w:val="nil"/>
-              <w:right w:val="single" w:sz="24" w:color="FFFFFF"/>
-            </w:tcBorders>
-            <w:tcMar>
-              <w:top w:w="90" w:type="dxa"/>
-              <w:start w:w="40" w:type="dxa"/>
-              <w:bottom w:w="90" w:type="dxa"/>
-              <w:end w:w="40" w:type="dxa"/>
-            </w:tcMar>
-          </w:tcPr>
-          <w:p>
-            <w:pPr>
-              <w:jc w:val="center"/>
-            </w:pPr>
-            <w:r>
-              <w:rPr>
-                <w:rFonts w:ascii="Georgia" w:hAnsi="Georgia" w:eastAsia="Georgia"/>
-                <w:b/>
-                <w:i w:val="0"/>
-                <w:color w:val="FFFFFF"/>
-                <w:sz w:val="40"/>
-              </w:rPr>
-              <w:t>a</w:t>
-            </w:r>
-          </w:p>
-        </w:tc>
-        <w:tc>
-          <w:tcPr>
-            <w:tcW w:type="dxa" w:w="1559"/>
-            <w:shd w:val="clear" w:color="auto" w:fill="B3402F"/>
-            <w:tcBorders>
-              <w:top w:val="nil"/>
-              <w:left w:val="single" w:sz="24" w:color="FFFFFF"/>
-              <w:bottom w:val="nil"/>
-              <w:right w:val="single" w:sz="24" w:color="FFFFFF"/>
-            </w:tcBorders>
-            <w:tcMar>
-              <w:top w:w="90" w:type="dxa"/>
-              <w:start w:w="40" w:type="dxa"/>
-              <w:bottom w:w="90" w:type="dxa"/>
-              <w:end w:w="40" w:type="dxa"/>
-            </w:tcMar>
-          </w:tcPr>
-          <w:p>
-            <w:pPr>
-              <w:jc w:val="center"/>
-            </w:pPr>
-            <w:r>
-              <w:rPr>
-                <w:rFonts w:ascii="Georgia" w:hAnsi="Georgia" w:eastAsia="Georgia"/>
-                <w:b/>
-                <w:i w:val="0"/>
-                <w:color w:val="FFFFFF"/>
-                <w:sz w:val="40"/>
-              </w:rPr>
-              <w:t>b</w:t>
-            </w:r>
-          </w:p>
-        </w:tc>
-        <w:tc>
-          <w:tcPr>
-            <w:tcW w:type="dxa" w:w="1559"/>
-            <w:shd w:val="clear" w:color="auto" w:fill="2E7D5B"/>
-            <w:tcBorders>
-              <w:top w:val="nil"/>
-              <w:left w:val="single" w:sz="24" w:color="FFFFFF"/>
-              <w:bottom w:val="nil"/>
-              <w:right w:val="single" w:sz="24" w:color="FFFFFF"/>
-            </w:tcBorders>
-            <w:tcMar>
-              <w:top w:w="90" w:type="dxa"/>
-              <w:start w:w="40" w:type="dxa"/>
-              <w:bottom w:w="90" w:type="dxa"/>
-              <w:end w:w="40" w:type="dxa"/>
-            </w:tcMar>
-          </w:tcPr>
-          <w:p>
-            <w:pPr>
-              <w:jc w:val="center"/>
-            </w:pPr>
-            <w:r>
-              <w:rPr>
-                <w:rFonts w:ascii="Georgia" w:hAnsi="Georgia" w:eastAsia="Georgia"/>
-                <w:b/>
-                <w:i w:val="0"/>
-                <w:color w:val="FFFFFF"/>
-                <w:sz w:val="40"/>
-              </w:rPr>
-              <w:t>c</w:t>
-            </w:r>
-          </w:p>
-        </w:tc>
-        <w:tc>
-          <w:tcPr>
-            <w:tcW w:type="dxa" w:w="1559"/>
-            <w:shd w:val="clear" w:color="auto" w:fill="C98A0B"/>
-            <w:tcBorders>
-              <w:top w:val="nil"/>
-              <w:left w:val="single" w:sz="24" w:color="FFFFFF"/>
-              <w:bottom w:val="nil"/>
-              <w:right w:val="single" w:sz="24" w:color="FFFFFF"/>
-            </w:tcBorders>
-            <w:tcMar>
-              <w:top w:w="90" w:type="dxa"/>
-              <w:start w:w="40" w:type="dxa"/>
-              <w:bottom w:w="90" w:type="dxa"/>
-              <w:end w:w="40" w:type="dxa"/>
-            </w:tcMar>
-          </w:tcPr>
-          <w:p>
-            <w:pPr>
-              <w:jc w:val="center"/>
-            </w:pPr>
-            <w:r>
-              <w:rPr>
-                <w:rFonts w:ascii="Georgia" w:hAnsi="Georgia" w:eastAsia="Georgia"/>
-                <w:b/>
-                <w:i w:val="0"/>
-                <w:color w:val="FFFFFF"/>
-                <w:sz w:val="40"/>
-              </w:rPr>
-              <w:t>d</w:t>
-            </w:r>
-          </w:p>
-        </w:tc>
-        <w:tc>
-          <w:tcPr>
-            <w:tcW w:type="dxa" w:w="1559"/>
-            <w:shd w:val="clear" w:color="auto" w:fill="2E7D5B"/>
-            <w:tcBorders>
-              <w:top w:val="nil"/>
-              <w:left w:val="single" w:sz="24" w:color="FFFFFF"/>
-              <w:bottom w:val="nil"/>
-              <w:right w:val="single" w:sz="24" w:color="FFFFFF"/>
-            </w:tcBorders>
-            <w:tcMar>
-              <w:top w:w="90" w:type="dxa"/>
-              <w:start w:w="40" w:type="dxa"/>
-              <w:bottom w:w="90" w:type="dxa"/>
-              <w:end w:w="40" w:type="dxa"/>
-            </w:tcMar>
-          </w:tcPr>
-          <w:p>
-            <w:pPr>
-              <w:jc w:val="center"/>
-            </w:pPr>
-            <w:r>
-              <w:rPr>
-                <w:rFonts w:ascii="Georgia" w:hAnsi="Georgia" w:eastAsia="Georgia"/>
-                <w:b/>
-                <w:i w:val="0"/>
-                <w:color w:val="FFFFFF"/>
-                <w:sz w:val="40"/>
-              </w:rPr>
-              <w:t>e</w:t>
-            </w:r>
-          </w:p>
-        </w:tc>
-        <w:tc>
-          <w:tcPr>
-            <w:tcW w:type="dxa" w:w="1559"/>
-            <w:shd w:val="clear" w:color="auto" w:fill="B3402F"/>
-            <w:tcBorders>
-              <w:top w:val="nil"/>
-              <w:left w:val="single" w:sz="24" w:color="FFFFFF"/>
-              <w:bottom w:val="nil"/>
-              <w:right w:val="single" w:sz="24" w:color="FFFFFF"/>
-            </w:tcBorders>
-            <w:tcMar>
-              <w:top w:w="90" w:type="dxa"/>
-              <w:start w:w="40" w:type="dxa"/>
-              <w:bottom w:w="90" w:type="dxa"/>
-              <w:end w:w="40" w:type="dxa"/>
-            </w:tcMar>
-          </w:tcPr>
-          <w:p>
-            <w:pPr>
-              <w:jc w:val="center"/>
-            </w:pPr>
-            <w:r>
-              <w:rPr>
-                <w:rFonts w:ascii="Georgia" w:hAnsi="Georgia" w:eastAsia="Georgia"/>
-                <w:b/>
-                <w:i w:val="0"/>
-                <w:color w:val="FFFFFF"/>
-                <w:sz w:val="40"/>
-              </w:rPr>
-              <w:t>f</w:t>
-            </w:r>
-          </w:p>
-        </w:tc>
-      </w:tr>
-      <w:tr>
-        <w:tc>
-          <w:tcPr>
-            <w:tcW w:type="dxa" w:w="1559"/>
-            <w:tcBorders>
-              <w:top w:val="nil"/>
-              <w:left w:val="nil"/>
-              <w:bottom w:val="nil"/>
-              <w:right w:val="nil"/>
-            </w:tcBorders>
-            <w:tcMar>
-              <w:top w:w="40" w:type="dxa"/>
-              <w:start w:w="30" w:type="dxa"/>
-              <w:bottom w:w="40" w:type="dxa"/>
-              <w:end w:w="30" w:type="dxa"/>
-            </w:tcMar>
-          </w:tcPr>
-          <w:p>
-            <w:pPr>
-              <w:jc w:val="center"/>
-            </w:pPr>
-            <w:r>
-              <w:rPr>
-                <w:rFonts w:ascii="Georgia" w:hAnsi="Georgia" w:eastAsia="Georgia"/>
-                <w:b w:val="0"/>
-                <w:i w:val="0"/>
-                <w:color w:val="444444"/>
-                <w:sz w:val="16"/>
-              </w:rPr>
-              <w:t>Alegado, não comprovado</w:t>
-            </w:r>
-          </w:p>
-        </w:tc>
-        <w:tc>
-          <w:tcPr>
-            <w:tcW w:type="dxa" w:w="1559"/>
-            <w:tcBorders>
-              <w:top w:val="nil"/>
-              <w:left w:val="nil"/>
-              <w:bottom w:val="nil"/>
-              <w:right w:val="nil"/>
-            </w:tcBorders>
-            <w:tcMar>
-              <w:top w:w="40" w:type="dxa"/>
-              <w:start w:w="30" w:type="dxa"/>
-              <w:bottom w:w="40" w:type="dxa"/>
-              <w:end w:w="30" w:type="dxa"/>
-            </w:tcMar>
-          </w:tcPr>
-          <w:p>
-            <w:pPr>
-              <w:jc w:val="center"/>
-            </w:pPr>
-            <w:r>
-              <w:rPr>
-                <w:rFonts w:ascii="Georgia" w:hAnsi="Georgia" w:eastAsia="Georgia"/>
-                <w:b w:val="0"/>
-                <w:i w:val="0"/>
-                <w:color w:val="444444"/>
-                <w:sz w:val="16"/>
-              </w:rPr>
-              <w:t>Não encontrei nos autos</w:t>
-            </w:r>
-          </w:p>
-        </w:tc>
-        <w:tc>
-          <w:tcPr>
-            <w:tcW w:type="dxa" w:w="1559"/>
-            <w:tcBorders>
-              <w:top w:val="nil"/>
-              <w:left w:val="nil"/>
-              <w:bottom w:val="nil"/>
-              <w:right w:val="nil"/>
-            </w:tcBorders>
-            <w:tcMar>
-              <w:top w:w="40" w:type="dxa"/>
-              <w:start w:w="30" w:type="dxa"/>
-              <w:bottom w:w="40" w:type="dxa"/>
-              <w:end w:w="30" w:type="dxa"/>
-            </w:tcMar>
-          </w:tcPr>
-          <w:p>
-            <w:pPr>
-              <w:jc w:val="center"/>
-            </w:pPr>
-            <w:r>
-              <w:rPr>
-                <w:rFonts w:ascii="Georgia" w:hAnsi="Georgia" w:eastAsia="Georgia"/>
-                <w:b w:val="0"/>
-                <w:i w:val="0"/>
-                <w:color w:val="444444"/>
-                <w:sz w:val="16"/>
-              </w:rPr>
-              <w:t>Atendido</w:t>
-            </w:r>
-          </w:p>
-        </w:tc>
-        <w:tc>
-          <w:tcPr>
-            <w:tcW w:type="dxa" w:w="1559"/>
-            <w:tcBorders>
-              <w:top w:val="nil"/>
-              <w:left w:val="nil"/>
-              <w:bottom w:val="nil"/>
-              <w:right w:val="nil"/>
-            </w:tcBorders>
-            <w:tcMar>
-              <w:top w:w="40" w:type="dxa"/>
-              <w:start w:w="30" w:type="dxa"/>
-              <w:bottom w:w="40" w:type="dxa"/>
-              <w:end w:w="30" w:type="dxa"/>
-            </w:tcMar>
-          </w:tcPr>
-          <w:p>
-            <w:pPr>
-              <w:jc w:val="center"/>
-            </w:pPr>
-            <w:r>
-              <w:rPr>
-                <w:rFonts w:ascii="Georgia" w:hAnsi="Georgia" w:eastAsia="Georgia"/>
-                <w:b w:val="0"/>
-                <w:i w:val="0"/>
-                <w:color w:val="444444"/>
-                <w:sz w:val="16"/>
-              </w:rPr>
-              <w:t>Alegado, não comprovado</w:t>
-            </w:r>
-          </w:p>
-        </w:tc>
-        <w:tc>
-          <w:tcPr>
-            <w:tcW w:type="dxa" w:w="1559"/>
-            <w:tcBorders>
-              <w:top w:val="nil"/>
-              <w:left w:val="nil"/>
-              <w:bottom w:val="nil"/>
-              <w:right w:val="nil"/>
-            </w:tcBorders>
-            <w:tcMar>
-              <w:top w:w="40" w:type="dxa"/>
-              <w:start w:w="30" w:type="dxa"/>
-              <w:bottom w:w="40" w:type="dxa"/>
-              <w:end w:w="30" w:type="dxa"/>
-            </w:tcMar>
-          </w:tcPr>
-          <w:p>
-            <w:pPr>
-              <w:jc w:val="center"/>
-            </w:pPr>
-            <w:r>
-              <w:rPr>
-                <w:rFonts w:ascii="Georgia" w:hAnsi="Georgia" w:eastAsia="Georgia"/>
-                <w:b w:val="0"/>
-                <w:i w:val="0"/>
-                <w:color w:val="444444"/>
-                <w:sz w:val="16"/>
-              </w:rPr>
-              <w:t>Atendido</w:t>
-            </w:r>
-          </w:p>
-        </w:tc>
-        <w:tc>
-          <w:tcPr>
-            <w:tcW w:type="dxa" w:w="1559"/>
-            <w:tcBorders>
-              <w:top w:val="nil"/>
-              <w:left w:val="nil"/>
-              <w:bottom w:val="nil"/>
-              <w:right w:val="nil"/>
-            </w:tcBorders>
-            <w:tcMar>
-              <w:top w:w="40" w:type="dxa"/>
-              <w:start w:w="30" w:type="dxa"/>
-              <w:bottom w:w="40" w:type="dxa"/>
-              <w:end w:w="30" w:type="dxa"/>
-            </w:tcMar>
-          </w:tcPr>
-          <w:p>
-            <w:pPr>
-              <w:jc w:val="center"/>
-            </w:pPr>
-            <w:r>
-              <w:rPr>
-                <w:rFonts w:ascii="Georgia" w:hAnsi="Georgia" w:eastAsia="Georgia"/>
-                <w:b w:val="0"/>
-                <w:i w:val="0"/>
-                <w:color w:val="444444"/>
-                <w:sz w:val="16"/>
-              </w:rPr>
-              <w:t>Não encontrei nos autos</w:t>
-            </w:r>
-          </w:p>
-        </w:tc>
-      </w:tr>
-    </w:tbl>
     <w:p>
       <w:pPr>
-        <w:spacing w:after="0"/>
+        <w:spacing w:after="80"/>
       </w:pPr>
+      <w:r>
+        <w:rPr>
+          <w:rFonts w:ascii="Georgia" w:hAnsi="Georgia" w:eastAsia="Georgia"/>
+          <w:b/>
+          <w:i w:val="0"/>
+          <w:sz w:val="22"/>
+        </w:rPr>
+        <w:t xml:space="preserve">O autor não cumpriu todos os requisitos do Tema 6. </w:t>
+      </w:r>
+      <w:r>
+        <w:rPr>
+          <w:rFonts w:ascii="Georgia" w:hAnsi="Georgia" w:eastAsia="Georgia"/>
+          <w:b w:val="0"/>
+          <w:i w:val="0"/>
+          <w:sz w:val="22"/>
+        </w:rPr>
+        <w:t xml:space="preserve">Estão atendidos ou dispensados 2 de 6. </w:t>
+      </w:r>
+      <w:r>
+        <w:rPr>
+          <w:rFonts w:ascii="Georgia" w:hAnsi="Georgia" w:eastAsia="Georgia"/>
+          <w:b w:val="0"/>
+          <w:i w:val="0"/>
+          <w:sz w:val="22"/>
+        </w:rPr>
+        <w:t>Faltam a prova da negativa administrativa e a prova da incapacidade financeira. O laudo cita estudos, mas não ensaio clínico randomizado.</w:t>
+      </w:r>
+    </w:p>
+    <w:p>
+      <w:pPr>
+        <w:spacing w:before="360" w:after="120"/>
+      </w:pPr>
+      <w:r>
+        <w:rPr>
+          <w:rFonts w:ascii="Georgia" w:hAnsi="Georgia" w:eastAsia="Georgia"/>
+          <w:b/>
+          <w:i w:val="0"/>
+          <w:color w:val="064A45"/>
+          <w:sz w:val="24"/>
+        </w:rPr>
+        <w:t>Tema 6: requisitos</w:t>
+      </w:r>
     </w:p>
     <w:tbl>
       <w:tblPr>
@@ -816,14 +300,19 @@
       <w:tr>
         <w:tc>
           <w:tcPr>
-            <w:tcW w:type="dxa" w:w="2551"/>
-            <w:shd w:val="clear" w:color="auto" w:fill="064A45"/>
+            <w:tcW w:type="dxa" w:w="2608"/>
             <w:tcMar>
-              <w:top w:w="70" w:type="dxa"/>
-              <w:start w:w="100" w:type="dxa"/>
-              <w:bottom w:w="70" w:type="dxa"/>
-              <w:end w:w="100" w:type="dxa"/>
+              <w:top w:w="60" w:type="dxa"/>
+              <w:start w:w="80" w:type="dxa"/>
+              <w:bottom w:w="60" w:type="dxa"/>
+              <w:end w:w="80" w:type="dxa"/>
             </w:tcMar>
+            <w:tcBorders>
+              <w:top w:val="nil"/>
+              <w:left w:val="nil"/>
+              <w:bottom w:val="single" w:sz="10" w:color="064A45"/>
+              <w:right w:val="nil"/>
+            </w:tcBorders>
           </w:tcPr>
           <w:p>
             <w:r>
@@ -831,8 +320,8 @@
                 <w:rFonts w:ascii="Georgia" w:hAnsi="Georgia" w:eastAsia="Georgia"/>
                 <w:b/>
                 <w:i w:val="0"/>
-                <w:color w:val="FFFFFF"/>
-                <w:sz w:val="19"/>
+                <w:color w:val="064A45"/>
+                <w:sz w:val="18"/>
               </w:rPr>
               <w:t>Requisito</w:t>
             </w:r>
@@ -840,14 +329,19 @@
         </w:tc>
         <w:tc>
           <w:tcPr>
-            <w:tcW w:type="dxa" w:w="1587"/>
-            <w:shd w:val="clear" w:color="auto" w:fill="064A45"/>
+            <w:tcW w:type="dxa" w:w="1757"/>
             <w:tcMar>
-              <w:top w:w="70" w:type="dxa"/>
-              <w:start w:w="100" w:type="dxa"/>
-              <w:bottom w:w="70" w:type="dxa"/>
-              <w:end w:w="100" w:type="dxa"/>
+              <w:top w:w="60" w:type="dxa"/>
+              <w:start w:w="80" w:type="dxa"/>
+              <w:bottom w:w="60" w:type="dxa"/>
+              <w:end w:w="80" w:type="dxa"/>
             </w:tcMar>
+            <w:tcBorders>
+              <w:top w:val="nil"/>
+              <w:left w:val="nil"/>
+              <w:bottom w:val="single" w:sz="10" w:color="064A45"/>
+              <w:right w:val="nil"/>
+            </w:tcBorders>
           </w:tcPr>
           <w:p>
             <w:r>
@@ -855,8 +349,8 @@
                 <w:rFonts w:ascii="Georgia" w:hAnsi="Georgia" w:eastAsia="Georgia"/>
                 <w:b/>
                 <w:i w:val="0"/>
-                <w:color w:val="FFFFFF"/>
-                <w:sz w:val="19"/>
+                <w:color w:val="064A45"/>
+                <w:sz w:val="18"/>
               </w:rPr>
               <w:t>Situação</w:t>
             </w:r>
@@ -864,14 +358,19 @@
         </w:tc>
         <w:tc>
           <w:tcPr>
-            <w:tcW w:type="dxa" w:w="2098"/>
-            <w:shd w:val="clear" w:color="auto" w:fill="064A45"/>
+            <w:tcW w:type="dxa" w:w="1644"/>
             <w:tcMar>
-              <w:top w:w="70" w:type="dxa"/>
-              <w:start w:w="100" w:type="dxa"/>
-              <w:bottom w:w="70" w:type="dxa"/>
-              <w:end w:w="100" w:type="dxa"/>
+              <w:top w:w="60" w:type="dxa"/>
+              <w:start w:w="80" w:type="dxa"/>
+              <w:bottom w:w="60" w:type="dxa"/>
+              <w:end w:w="80" w:type="dxa"/>
             </w:tcMar>
+            <w:tcBorders>
+              <w:top w:val="nil"/>
+              <w:left w:val="nil"/>
+              <w:bottom w:val="single" w:sz="10" w:color="064A45"/>
+              <w:right w:val="nil"/>
+            </w:tcBorders>
           </w:tcPr>
           <w:p>
             <w:r>
@@ -879,8 +378,8 @@
                 <w:rFonts w:ascii="Georgia" w:hAnsi="Georgia" w:eastAsia="Georgia"/>
                 <w:b/>
                 <w:i w:val="0"/>
-                <w:color w:val="FFFFFF"/>
-                <w:sz w:val="19"/>
+                <w:color w:val="064A45"/>
+                <w:sz w:val="18"/>
               </w:rPr>
               <w:t>Onde nos autos</w:t>
             </w:r>
@@ -888,14 +387,19 @@
         </w:tc>
         <w:tc>
           <w:tcPr>
-            <w:tcW w:type="dxa" w:w="3118"/>
-            <w:shd w:val="clear" w:color="auto" w:fill="064A45"/>
+            <w:tcW w:type="dxa" w:w="3345"/>
             <w:tcMar>
-              <w:top w:w="70" w:type="dxa"/>
-              <w:start w:w="100" w:type="dxa"/>
-              <w:bottom w:w="70" w:type="dxa"/>
-              <w:end w:w="100" w:type="dxa"/>
+              <w:top w:w="60" w:type="dxa"/>
+              <w:start w:w="80" w:type="dxa"/>
+              <w:bottom w:w="60" w:type="dxa"/>
+              <w:end w:w="80" w:type="dxa"/>
             </w:tcMar>
+            <w:tcBorders>
+              <w:top w:val="nil"/>
+              <w:left w:val="nil"/>
+              <w:bottom w:val="single" w:sz="10" w:color="064A45"/>
+              <w:right w:val="nil"/>
+            </w:tcBorders>
           </w:tcPr>
           <w:p>
             <w:r>
@@ -903,8 +407,8 @@
                 <w:rFonts w:ascii="Georgia" w:hAnsi="Georgia" w:eastAsia="Georgia"/>
                 <w:b/>
                 <w:i w:val="0"/>
-                <w:color w:val="FFFFFF"/>
-                <w:sz w:val="19"/>
+                <w:color w:val="064A45"/>
+                <w:sz w:val="18"/>
               </w:rPr>
               <w:t>Observação</w:t>
             </w:r>
@@ -914,12 +418,12 @@
       <w:tr>
         <w:tc>
           <w:tcPr>
-            <w:tcW w:type="dxa" w:w="2551"/>
+            <w:tcW w:type="dxa" w:w="2608"/>
             <w:tcMar>
               <w:top w:w="70" w:type="dxa"/>
-              <w:start w:w="100" w:type="dxa"/>
+              <w:start w:w="80" w:type="dxa"/>
               <w:bottom w:w="70" w:type="dxa"/>
-              <w:end w:w="100" w:type="dxa"/>
+              <w:end w:w="80" w:type="dxa"/>
             </w:tcMar>
             <w:tcBorders>
               <w:top w:val="nil"/>
@@ -927,15 +431,13 @@
               <w:bottom w:val="single" w:sz="4" w:color="D9D9D9"/>
               <w:right w:val="nil"/>
             </w:tcBorders>
-            <w:shd w:val="clear" w:color="auto" w:fill="FFFFFF"/>
           </w:tcPr>
           <w:p>
             <w:r>
               <w:rPr>
                 <w:rFonts w:ascii="Georgia" w:hAnsi="Georgia" w:eastAsia="Georgia"/>
-                <w:b/>
+                <w:b w:val="0"/>
                 <w:i w:val="0"/>
-                <w:color w:val="064A45"/>
                 <w:sz w:val="19"/>
               </w:rPr>
               <w:t>(a) Negativa na via administrativa</w:t>
@@ -944,12 +446,12 @@
         </w:tc>
         <w:tc>
           <w:tcPr>
-            <w:tcW w:type="dxa" w:w="1587"/>
+            <w:tcW w:type="dxa" w:w="1757"/>
             <w:tcMar>
               <w:top w:w="70" w:type="dxa"/>
-              <w:start w:w="100" w:type="dxa"/>
+              <w:start w:w="80" w:type="dxa"/>
               <w:bottom w:w="70" w:type="dxa"/>
-              <w:end w:w="100" w:type="dxa"/>
+              <w:end w:w="80" w:type="dxa"/>
             </w:tcMar>
             <w:tcBorders>
               <w:top w:val="nil"/>
@@ -957,20 +459,25 @@
               <w:bottom w:val="single" w:sz="4" w:color="D9D9D9"/>
               <w:right w:val="nil"/>
             </w:tcBorders>
-            <w:shd w:val="clear" w:color="auto" w:fill="C98A0B"/>
-            <w:vAlign w:val="center"/>
           </w:tcPr>
           <w:p>
-            <w:pPr>
-              <w:jc w:val="center"/>
-            </w:pPr>
+            <w:r>
+              <w:rPr>
+                <w:rFonts w:ascii="Georgia" w:hAnsi="Georgia" w:eastAsia="Georgia"/>
+                <w:b w:val="0"/>
+                <w:i w:val="0"/>
+                <w:color w:val="C98A0B"/>
+                <w:sz w:val="19"/>
+              </w:rPr>
+              <w:t xml:space="preserve">● </w:t>
+            </w:r>
             <w:r>
               <w:rPr>
                 <w:rFonts w:ascii="Georgia" w:hAnsi="Georgia" w:eastAsia="Georgia"/>
                 <w:b/>
                 <w:i w:val="0"/>
-                <w:color w:val="FFFFFF"/>
-                <w:sz w:val="17"/>
+                <w:color w:val="C98A0B"/>
+                <w:sz w:val="19"/>
               </w:rPr>
               <w:t>Alegado, não comprovado</w:t>
             </w:r>
@@ -978,12 +485,12 @@
         </w:tc>
         <w:tc>
           <w:tcPr>
-            <w:tcW w:type="dxa" w:w="2098"/>
+            <w:tcW w:type="dxa" w:w="1644"/>
             <w:tcMar>
               <w:top w:w="70" w:type="dxa"/>
-              <w:start w:w="100" w:type="dxa"/>
+              <w:start w:w="80" w:type="dxa"/>
               <w:bottom w:w="70" w:type="dxa"/>
-              <w:end w:w="100" w:type="dxa"/>
+              <w:end w:w="80" w:type="dxa"/>
             </w:tcMar>
             <w:tcBorders>
               <w:top w:val="nil"/>
@@ -991,7 +498,6 @@
               <w:bottom w:val="single" w:sz="4" w:color="D9D9D9"/>
               <w:right w:val="nil"/>
             </w:tcBorders>
-            <w:shd w:val="clear" w:color="auto" w:fill="FFFFFF"/>
           </w:tcPr>
           <w:p>
             <w:r>
@@ -1007,12 +513,12 @@
         </w:tc>
         <w:tc>
           <w:tcPr>
-            <w:tcW w:type="dxa" w:w="3118"/>
+            <w:tcW w:type="dxa" w:w="3345"/>
             <w:tcMar>
               <w:top w:w="70" w:type="dxa"/>
-              <w:start w:w="100" w:type="dxa"/>
+              <w:start w:w="80" w:type="dxa"/>
               <w:bottom w:w="70" w:type="dxa"/>
-              <w:end w:w="100" w:type="dxa"/>
+              <w:end w:w="80" w:type="dxa"/>
             </w:tcMar>
             <w:tcBorders>
               <w:top w:val="nil"/>
@@ -1020,7 +526,6 @@
               <w:bottom w:val="single" w:sz="4" w:color="D9D9D9"/>
               <w:right w:val="nil"/>
             </w:tcBorders>
-            <w:shd w:val="clear" w:color="auto" w:fill="FFFFFF"/>
           </w:tcPr>
           <w:p>
             <w:r>
@@ -1038,12 +543,12 @@
       <w:tr>
         <w:tc>
           <w:tcPr>
-            <w:tcW w:type="dxa" w:w="2551"/>
+            <w:tcW w:type="dxa" w:w="2608"/>
             <w:tcMar>
               <w:top w:w="70" w:type="dxa"/>
-              <w:start w:w="100" w:type="dxa"/>
+              <w:start w:w="80" w:type="dxa"/>
               <w:bottom w:w="70" w:type="dxa"/>
-              <w:end w:w="100" w:type="dxa"/>
+              <w:end w:w="80" w:type="dxa"/>
             </w:tcMar>
             <w:tcBorders>
               <w:top w:val="nil"/>
@@ -1051,15 +556,13 @@
               <w:bottom w:val="single" w:sz="4" w:color="D9D9D9"/>
               <w:right w:val="nil"/>
             </w:tcBorders>
-            <w:shd w:val="clear" w:color="auto" w:fill="F4F4F4"/>
           </w:tcPr>
           <w:p>
             <w:r>
               <w:rPr>
                 <w:rFonts w:ascii="Georgia" w:hAnsi="Georgia" w:eastAsia="Georgia"/>
-                <w:b/>
+                <w:b w:val="0"/>
                 <w:i w:val="0"/>
-                <w:color w:val="064A45"/>
                 <w:sz w:val="19"/>
               </w:rPr>
               <w:t>(b) Ilegalidade da não incorporação pela Conitec</w:t>
@@ -1068,12 +571,12 @@
         </w:tc>
         <w:tc>
           <w:tcPr>
-            <w:tcW w:type="dxa" w:w="1587"/>
+            <w:tcW w:type="dxa" w:w="1757"/>
             <w:tcMar>
               <w:top w:w="70" w:type="dxa"/>
-              <w:start w:w="100" w:type="dxa"/>
+              <w:start w:w="80" w:type="dxa"/>
               <w:bottom w:w="70" w:type="dxa"/>
-              <w:end w:w="100" w:type="dxa"/>
+              <w:end w:w="80" w:type="dxa"/>
             </w:tcMar>
             <w:tcBorders>
               <w:top w:val="nil"/>
@@ -1081,20 +584,25 @@
               <w:bottom w:val="single" w:sz="4" w:color="D9D9D9"/>
               <w:right w:val="nil"/>
             </w:tcBorders>
-            <w:shd w:val="clear" w:color="auto" w:fill="B3402F"/>
-            <w:vAlign w:val="center"/>
           </w:tcPr>
           <w:p>
-            <w:pPr>
-              <w:jc w:val="center"/>
-            </w:pPr>
+            <w:r>
+              <w:rPr>
+                <w:rFonts w:ascii="Georgia" w:hAnsi="Georgia" w:eastAsia="Georgia"/>
+                <w:b w:val="0"/>
+                <w:i w:val="0"/>
+                <w:color w:val="B3402F"/>
+                <w:sz w:val="19"/>
+              </w:rPr>
+              <w:t xml:space="preserve">● </w:t>
+            </w:r>
             <w:r>
               <w:rPr>
                 <w:rFonts w:ascii="Georgia" w:hAnsi="Georgia" w:eastAsia="Georgia"/>
                 <w:b/>
                 <w:i w:val="0"/>
-                <w:color w:val="FFFFFF"/>
-                <w:sz w:val="17"/>
+                <w:color w:val="B3402F"/>
+                <w:sz w:val="19"/>
               </w:rPr>
               <w:t>Não encontrei nos autos</w:t>
             </w:r>
@@ -1102,12 +610,12 @@
         </w:tc>
         <w:tc>
           <w:tcPr>
-            <w:tcW w:type="dxa" w:w="2098"/>
+            <w:tcW w:type="dxa" w:w="1644"/>
             <w:tcMar>
               <w:top w:w="70" w:type="dxa"/>
-              <w:start w:w="100" w:type="dxa"/>
+              <w:start w:w="80" w:type="dxa"/>
               <w:bottom w:w="70" w:type="dxa"/>
-              <w:end w:w="100" w:type="dxa"/>
+              <w:end w:w="80" w:type="dxa"/>
             </w:tcMar>
             <w:tcBorders>
               <w:top w:val="nil"/>
@@ -1115,7 +623,6 @@
               <w:bottom w:val="single" w:sz="4" w:color="D9D9D9"/>
               <w:right w:val="nil"/>
             </w:tcBorders>
-            <w:shd w:val="clear" w:color="auto" w:fill="F4F4F4"/>
           </w:tcPr>
           <w:p>
             <w:r>
@@ -1131,12 +638,12 @@
         </w:tc>
         <w:tc>
           <w:tcPr>
-            <w:tcW w:type="dxa" w:w="3118"/>
+            <w:tcW w:type="dxa" w:w="3345"/>
             <w:tcMar>
               <w:top w:w="70" w:type="dxa"/>
-              <w:start w:w="100" w:type="dxa"/>
+              <w:start w:w="80" w:type="dxa"/>
               <w:bottom w:w="70" w:type="dxa"/>
-              <w:end w:w="100" w:type="dxa"/>
+              <w:end w:w="80" w:type="dxa"/>
             </w:tcMar>
             <w:tcBorders>
               <w:top w:val="nil"/>
@@ -1144,7 +651,6 @@
               <w:bottom w:val="single" w:sz="4" w:color="D9D9D9"/>
               <w:right w:val="nil"/>
             </w:tcBorders>
-            <w:shd w:val="clear" w:color="auto" w:fill="F4F4F4"/>
           </w:tcPr>
           <w:p>
             <w:r>
@@ -1162,12 +668,12 @@
       <w:tr>
         <w:tc>
           <w:tcPr>
-            <w:tcW w:type="dxa" w:w="2551"/>
+            <w:tcW w:type="dxa" w:w="2608"/>
             <w:tcMar>
               <w:top w:w="70" w:type="dxa"/>
-              <w:start w:w="100" w:type="dxa"/>
+              <w:start w:w="80" w:type="dxa"/>
               <w:bottom w:w="70" w:type="dxa"/>
-              <w:end w:w="100" w:type="dxa"/>
+              <w:end w:w="80" w:type="dxa"/>
             </w:tcMar>
             <w:tcBorders>
               <w:top w:val="nil"/>
@@ -1175,15 +681,13 @@
               <w:bottom w:val="single" w:sz="4" w:color="D9D9D9"/>
               <w:right w:val="nil"/>
             </w:tcBorders>
-            <w:shd w:val="clear" w:color="auto" w:fill="FFFFFF"/>
           </w:tcPr>
           <w:p>
             <w:r>
               <w:rPr>
                 <w:rFonts w:ascii="Georgia" w:hAnsi="Georgia" w:eastAsia="Georgia"/>
-                <w:b/>
+                <w:b w:val="0"/>
                 <w:i w:val="0"/>
-                <w:color w:val="064A45"/>
                 <w:sz w:val="19"/>
               </w:rPr>
               <w:t>(c) Impossibilidade de substituição por medicamento do SUS</w:t>
@@ -1192,12 +696,12 @@
         </w:tc>
         <w:tc>
           <w:tcPr>
-            <w:tcW w:type="dxa" w:w="1587"/>
+            <w:tcW w:type="dxa" w:w="1757"/>
             <w:tcMar>
               <w:top w:w="70" w:type="dxa"/>
-              <w:start w:w="100" w:type="dxa"/>
+              <w:start w:w="80" w:type="dxa"/>
               <w:bottom w:w="70" w:type="dxa"/>
-              <w:end w:w="100" w:type="dxa"/>
+              <w:end w:w="80" w:type="dxa"/>
             </w:tcMar>
             <w:tcBorders>
               <w:top w:val="nil"/>
@@ -1205,20 +709,25 @@
               <w:bottom w:val="single" w:sz="4" w:color="D9D9D9"/>
               <w:right w:val="nil"/>
             </w:tcBorders>
-            <w:shd w:val="clear" w:color="auto" w:fill="2E7D5B"/>
-            <w:vAlign w:val="center"/>
           </w:tcPr>
           <w:p>
-            <w:pPr>
-              <w:jc w:val="center"/>
-            </w:pPr>
+            <w:r>
+              <w:rPr>
+                <w:rFonts w:ascii="Georgia" w:hAnsi="Georgia" w:eastAsia="Georgia"/>
+                <w:b w:val="0"/>
+                <w:i w:val="0"/>
+                <w:color w:val="2E7D5B"/>
+                <w:sz w:val="19"/>
+              </w:rPr>
+              <w:t xml:space="preserve">● </w:t>
+            </w:r>
             <w:r>
               <w:rPr>
                 <w:rFonts w:ascii="Georgia" w:hAnsi="Georgia" w:eastAsia="Georgia"/>
                 <w:b/>
                 <w:i w:val="0"/>
-                <w:color w:val="FFFFFF"/>
-                <w:sz w:val="17"/>
+                <w:color w:val="2E7D5B"/>
+                <w:sz w:val="19"/>
               </w:rPr>
               <w:t>Atendido</w:t>
             </w:r>
@@ -1226,12 +735,12 @@
         </w:tc>
         <w:tc>
           <w:tcPr>
-            <w:tcW w:type="dxa" w:w="2098"/>
+            <w:tcW w:type="dxa" w:w="1644"/>
             <w:tcMar>
               <w:top w:w="70" w:type="dxa"/>
-              <w:start w:w="100" w:type="dxa"/>
+              <w:start w:w="80" w:type="dxa"/>
               <w:bottom w:w="70" w:type="dxa"/>
-              <w:end w:w="100" w:type="dxa"/>
+              <w:end w:w="80" w:type="dxa"/>
             </w:tcMar>
             <w:tcBorders>
               <w:top w:val="nil"/>
@@ -1239,7 +748,6 @@
               <w:bottom w:val="single" w:sz="4" w:color="D9D9D9"/>
               <w:right w:val="nil"/>
             </w:tcBorders>
-            <w:shd w:val="clear" w:color="auto" w:fill="FFFFFF"/>
           </w:tcPr>
           <w:p>
             <w:r>
@@ -1255,12 +763,12 @@
         </w:tc>
         <w:tc>
           <w:tcPr>
-            <w:tcW w:type="dxa" w:w="3118"/>
+            <w:tcW w:type="dxa" w:w="3345"/>
             <w:tcMar>
               <w:top w:w="70" w:type="dxa"/>
-              <w:start w:w="100" w:type="dxa"/>
+              <w:start w:w="80" w:type="dxa"/>
               <w:bottom w:w="70" w:type="dxa"/>
-              <w:end w:w="100" w:type="dxa"/>
+              <w:end w:w="80" w:type="dxa"/>
             </w:tcMar>
             <w:tcBorders>
               <w:top w:val="nil"/>
@@ -1268,7 +776,6 @@
               <w:bottom w:val="single" w:sz="4" w:color="D9D9D9"/>
               <w:right w:val="nil"/>
             </w:tcBorders>
-            <w:shd w:val="clear" w:color="auto" w:fill="FFFFFF"/>
           </w:tcPr>
           <w:p>
             <w:r>
@@ -1286,12 +793,12 @@
       <w:tr>
         <w:tc>
           <w:tcPr>
-            <w:tcW w:type="dxa" w:w="2551"/>
+            <w:tcW w:type="dxa" w:w="2608"/>
             <w:tcMar>
               <w:top w:w="70" w:type="dxa"/>
-              <w:start w:w="100" w:type="dxa"/>
+              <w:start w:w="80" w:type="dxa"/>
               <w:bottom w:w="70" w:type="dxa"/>
-              <w:end w:w="100" w:type="dxa"/>
+              <w:end w:w="80" w:type="dxa"/>
             </w:tcMar>
             <w:tcBorders>
               <w:top w:val="nil"/>
@@ -1299,15 +806,13 @@
               <w:bottom w:val="single" w:sz="4" w:color="D9D9D9"/>
               <w:right w:val="nil"/>
             </w:tcBorders>
-            <w:shd w:val="clear" w:color="auto" w:fill="F4F4F4"/>
           </w:tcPr>
           <w:p>
             <w:r>
               <w:rPr>
                 <w:rFonts w:ascii="Georgia" w:hAnsi="Georgia" w:eastAsia="Georgia"/>
-                <w:b/>
+                <w:b w:val="0"/>
                 <w:i w:val="0"/>
-                <w:color w:val="064A45"/>
                 <w:sz w:val="19"/>
               </w:rPr>
               <w:t>(d) Evidência de alto nível (ensaio randomizado ou revisão sistemática)</w:t>
@@ -1316,12 +821,12 @@
         </w:tc>
         <w:tc>
           <w:tcPr>
-            <w:tcW w:type="dxa" w:w="1587"/>
+            <w:tcW w:type="dxa" w:w="1757"/>
             <w:tcMar>
               <w:top w:w="70" w:type="dxa"/>
-              <w:start w:w="100" w:type="dxa"/>
+              <w:start w:w="80" w:type="dxa"/>
               <w:bottom w:w="70" w:type="dxa"/>
-              <w:end w:w="100" w:type="dxa"/>
+              <w:end w:w="80" w:type="dxa"/>
             </w:tcMar>
             <w:tcBorders>
               <w:top w:val="nil"/>
@@ -1329,20 +834,25 @@
               <w:bottom w:val="single" w:sz="4" w:color="D9D9D9"/>
               <w:right w:val="nil"/>
             </w:tcBorders>
-            <w:shd w:val="clear" w:color="auto" w:fill="C98A0B"/>
-            <w:vAlign w:val="center"/>
           </w:tcPr>
           <w:p>
-            <w:pPr>
-              <w:jc w:val="center"/>
-            </w:pPr>
+            <w:r>
+              <w:rPr>
+                <w:rFonts w:ascii="Georgia" w:hAnsi="Georgia" w:eastAsia="Georgia"/>
+                <w:b w:val="0"/>
+                <w:i w:val="0"/>
+                <w:color w:val="C98A0B"/>
+                <w:sz w:val="19"/>
+              </w:rPr>
+              <w:t xml:space="preserve">● </w:t>
+            </w:r>
             <w:r>
               <w:rPr>
                 <w:rFonts w:ascii="Georgia" w:hAnsi="Georgia" w:eastAsia="Georgia"/>
                 <w:b/>
                 <w:i w:val="0"/>
-                <w:color w:val="FFFFFF"/>
-                <w:sz w:val="17"/>
+                <w:color w:val="C98A0B"/>
+                <w:sz w:val="19"/>
               </w:rPr>
               <w:t>Alegado, não comprovado</w:t>
             </w:r>
@@ -1350,12 +860,12 @@
         </w:tc>
         <w:tc>
           <w:tcPr>
-            <w:tcW w:type="dxa" w:w="2098"/>
+            <w:tcW w:type="dxa" w:w="1644"/>
             <w:tcMar>
               <w:top w:w="70" w:type="dxa"/>
-              <w:start w:w="100" w:type="dxa"/>
+              <w:start w:w="80" w:type="dxa"/>
               <w:bottom w:w="70" w:type="dxa"/>
-              <w:end w:w="100" w:type="dxa"/>
+              <w:end w:w="80" w:type="dxa"/>
             </w:tcMar>
             <w:tcBorders>
               <w:top w:val="nil"/>
@@ -1363,7 +873,6 @@
               <w:bottom w:val="single" w:sz="4" w:color="D9D9D9"/>
               <w:right w:val="nil"/>
             </w:tcBorders>
-            <w:shd w:val="clear" w:color="auto" w:fill="F4F4F4"/>
           </w:tcPr>
           <w:p>
             <w:r>
@@ -1379,12 +888,12 @@
         </w:tc>
         <w:tc>
           <w:tcPr>
-            <w:tcW w:type="dxa" w:w="3118"/>
+            <w:tcW w:type="dxa" w:w="3345"/>
             <w:tcMar>
               <w:top w:w="70" w:type="dxa"/>
-              <w:start w:w="100" w:type="dxa"/>
+              <w:start w:w="80" w:type="dxa"/>
               <w:bottom w:w="70" w:type="dxa"/>
-              <w:end w:w="100" w:type="dxa"/>
+              <w:end w:w="80" w:type="dxa"/>
             </w:tcMar>
             <w:tcBorders>
               <w:top w:val="nil"/>
@@ -1392,7 +901,6 @@
               <w:bottom w:val="single" w:sz="4" w:color="D9D9D9"/>
               <w:right w:val="nil"/>
             </w:tcBorders>
-            <w:shd w:val="clear" w:color="auto" w:fill="F4F4F4"/>
           </w:tcPr>
           <w:p>
             <w:r>
@@ -1410,12 +918,12 @@
       <w:tr>
         <w:tc>
           <w:tcPr>
-            <w:tcW w:type="dxa" w:w="2551"/>
+            <w:tcW w:type="dxa" w:w="2608"/>
             <w:tcMar>
               <w:top w:w="70" w:type="dxa"/>
-              <w:start w:w="100" w:type="dxa"/>
+              <w:start w:w="80" w:type="dxa"/>
               <w:bottom w:w="70" w:type="dxa"/>
-              <w:end w:w="100" w:type="dxa"/>
+              <w:end w:w="80" w:type="dxa"/>
             </w:tcMar>
             <w:tcBorders>
               <w:top w:val="nil"/>
@@ -1423,15 +931,13 @@
               <w:bottom w:val="single" w:sz="4" w:color="D9D9D9"/>
               <w:right w:val="nil"/>
             </w:tcBorders>
-            <w:shd w:val="clear" w:color="auto" w:fill="FFFFFF"/>
           </w:tcPr>
           <w:p>
             <w:r>
               <w:rPr>
                 <w:rFonts w:ascii="Georgia" w:hAnsi="Georgia" w:eastAsia="Georgia"/>
-                <w:b/>
+                <w:b w:val="0"/>
                 <w:i w:val="0"/>
-                <w:color w:val="064A45"/>
                 <w:sz w:val="19"/>
               </w:rPr>
               <w:t>(e) Imprescindibilidade clínica, com laudo fundamentado</w:t>
@@ -1440,12 +946,12 @@
         </w:tc>
         <w:tc>
           <w:tcPr>
-            <w:tcW w:type="dxa" w:w="1587"/>
+            <w:tcW w:type="dxa" w:w="1757"/>
             <w:tcMar>
               <w:top w:w="70" w:type="dxa"/>
-              <w:start w:w="100" w:type="dxa"/>
+              <w:start w:w="80" w:type="dxa"/>
               <w:bottom w:w="70" w:type="dxa"/>
-              <w:end w:w="100" w:type="dxa"/>
+              <w:end w:w="80" w:type="dxa"/>
             </w:tcMar>
             <w:tcBorders>
               <w:top w:val="nil"/>
@@ -1453,20 +959,25 @@
               <w:bottom w:val="single" w:sz="4" w:color="D9D9D9"/>
               <w:right w:val="nil"/>
             </w:tcBorders>
-            <w:shd w:val="clear" w:color="auto" w:fill="2E7D5B"/>
-            <w:vAlign w:val="center"/>
           </w:tcPr>
           <w:p>
-            <w:pPr>
-              <w:jc w:val="center"/>
-            </w:pPr>
+            <w:r>
+              <w:rPr>
+                <w:rFonts w:ascii="Georgia" w:hAnsi="Georgia" w:eastAsia="Georgia"/>
+                <w:b w:val="0"/>
+                <w:i w:val="0"/>
+                <w:color w:val="2E7D5B"/>
+                <w:sz w:val="19"/>
+              </w:rPr>
+              <w:t xml:space="preserve">● </w:t>
+            </w:r>
             <w:r>
               <w:rPr>
                 <w:rFonts w:ascii="Georgia" w:hAnsi="Georgia" w:eastAsia="Georgia"/>
                 <w:b/>
                 <w:i w:val="0"/>
-                <w:color w:val="FFFFFF"/>
-                <w:sz w:val="17"/>
+                <w:color w:val="2E7D5B"/>
+                <w:sz w:val="19"/>
               </w:rPr>
               <w:t>Atendido</w:t>
             </w:r>
@@ -1474,12 +985,12 @@
         </w:tc>
         <w:tc>
           <w:tcPr>
-            <w:tcW w:type="dxa" w:w="2098"/>
+            <w:tcW w:type="dxa" w:w="1644"/>
             <w:tcMar>
               <w:top w:w="70" w:type="dxa"/>
-              <w:start w:w="100" w:type="dxa"/>
+              <w:start w:w="80" w:type="dxa"/>
               <w:bottom w:w="70" w:type="dxa"/>
-              <w:end w:w="100" w:type="dxa"/>
+              <w:end w:w="80" w:type="dxa"/>
             </w:tcMar>
             <w:tcBorders>
               <w:top w:val="nil"/>
@@ -1487,7 +998,6 @@
               <w:bottom w:val="single" w:sz="4" w:color="D9D9D9"/>
               <w:right w:val="nil"/>
             </w:tcBorders>
-            <w:shd w:val="clear" w:color="auto" w:fill="FFFFFF"/>
           </w:tcPr>
           <w:p>
             <w:r>
@@ -1503,12 +1013,12 @@
         </w:tc>
         <w:tc>
           <w:tcPr>
-            <w:tcW w:type="dxa" w:w="3118"/>
+            <w:tcW w:type="dxa" w:w="3345"/>
             <w:tcMar>
               <w:top w:w="70" w:type="dxa"/>
-              <w:start w:w="100" w:type="dxa"/>
+              <w:start w:w="80" w:type="dxa"/>
               <w:bottom w:w="70" w:type="dxa"/>
-              <w:end w:w="100" w:type="dxa"/>
+              <w:end w:w="80" w:type="dxa"/>
             </w:tcMar>
             <w:tcBorders>
               <w:top w:val="nil"/>
@@ -1516,7 +1026,6 @@
               <w:bottom w:val="single" w:sz="4" w:color="D9D9D9"/>
               <w:right w:val="nil"/>
             </w:tcBorders>
-            <w:shd w:val="clear" w:color="auto" w:fill="FFFFFF"/>
           </w:tcPr>
           <w:p>
             <w:r>
@@ -1534,12 +1043,12 @@
       <w:tr>
         <w:tc>
           <w:tcPr>
-            <w:tcW w:type="dxa" w:w="2551"/>
+            <w:tcW w:type="dxa" w:w="2608"/>
             <w:tcMar>
               <w:top w:w="70" w:type="dxa"/>
-              <w:start w:w="100" w:type="dxa"/>
+              <w:start w:w="80" w:type="dxa"/>
               <w:bottom w:w="70" w:type="dxa"/>
-              <w:end w:w="100" w:type="dxa"/>
+              <w:end w:w="80" w:type="dxa"/>
             </w:tcMar>
             <w:tcBorders>
               <w:top w:val="nil"/>
@@ -1547,15 +1056,13 @@
               <w:bottom w:val="single" w:sz="4" w:color="D9D9D9"/>
               <w:right w:val="nil"/>
             </w:tcBorders>
-            <w:shd w:val="clear" w:color="auto" w:fill="F4F4F4"/>
           </w:tcPr>
           <w:p>
             <w:r>
               <w:rPr>
                 <w:rFonts w:ascii="Georgia" w:hAnsi="Georgia" w:eastAsia="Georgia"/>
-                <w:b/>
+                <w:b w:val="0"/>
                 <w:i w:val="0"/>
-                <w:color w:val="064A45"/>
                 <w:sz w:val="19"/>
               </w:rPr>
               <w:t>(f) Incapacidade financeira</w:t>
@@ -1564,12 +1071,12 @@
         </w:tc>
         <w:tc>
           <w:tcPr>
-            <w:tcW w:type="dxa" w:w="1587"/>
+            <w:tcW w:type="dxa" w:w="1757"/>
             <w:tcMar>
               <w:top w:w="70" w:type="dxa"/>
-              <w:start w:w="100" w:type="dxa"/>
+              <w:start w:w="80" w:type="dxa"/>
               <w:bottom w:w="70" w:type="dxa"/>
-              <w:end w:w="100" w:type="dxa"/>
+              <w:end w:w="80" w:type="dxa"/>
             </w:tcMar>
             <w:tcBorders>
               <w:top w:val="nil"/>
@@ -1577,20 +1084,25 @@
               <w:bottom w:val="single" w:sz="4" w:color="D9D9D9"/>
               <w:right w:val="nil"/>
             </w:tcBorders>
-            <w:shd w:val="clear" w:color="auto" w:fill="B3402F"/>
-            <w:vAlign w:val="center"/>
           </w:tcPr>
           <w:p>
-            <w:pPr>
-              <w:jc w:val="center"/>
-            </w:pPr>
+            <w:r>
+              <w:rPr>
+                <w:rFonts w:ascii="Georgia" w:hAnsi="Georgia" w:eastAsia="Georgia"/>
+                <w:b w:val="0"/>
+                <w:i w:val="0"/>
+                <w:color w:val="B3402F"/>
+                <w:sz w:val="19"/>
+              </w:rPr>
+              <w:t xml:space="preserve">● </w:t>
+            </w:r>
             <w:r>
               <w:rPr>
                 <w:rFonts w:ascii="Georgia" w:hAnsi="Georgia" w:eastAsia="Georgia"/>
                 <w:b/>
                 <w:i w:val="0"/>
-                <w:color w:val="FFFFFF"/>
-                <w:sz w:val="17"/>
+                <w:color w:val="B3402F"/>
+                <w:sz w:val="19"/>
               </w:rPr>
               <w:t>Não encontrei nos autos</w:t>
             </w:r>
@@ -1598,12 +1110,12 @@
         </w:tc>
         <w:tc>
           <w:tcPr>
-            <w:tcW w:type="dxa" w:w="2098"/>
+            <w:tcW w:type="dxa" w:w="1644"/>
             <w:tcMar>
               <w:top w:w="70" w:type="dxa"/>
-              <w:start w:w="100" w:type="dxa"/>
+              <w:start w:w="80" w:type="dxa"/>
               <w:bottom w:w="70" w:type="dxa"/>
-              <w:end w:w="100" w:type="dxa"/>
+              <w:end w:w="80" w:type="dxa"/>
             </w:tcMar>
             <w:tcBorders>
               <w:top w:val="nil"/>
@@ -1611,7 +1123,6 @@
               <w:bottom w:val="single" w:sz="4" w:color="D9D9D9"/>
               <w:right w:val="nil"/>
             </w:tcBorders>
-            <w:shd w:val="clear" w:color="auto" w:fill="F4F4F4"/>
           </w:tcPr>
           <w:p>
             <w:r>
@@ -1627,12 +1138,12 @@
         </w:tc>
         <w:tc>
           <w:tcPr>
-            <w:tcW w:type="dxa" w:w="3118"/>
+            <w:tcW w:type="dxa" w:w="3345"/>
             <w:tcMar>
               <w:top w:w="70" w:type="dxa"/>
-              <w:start w:w="100" w:type="dxa"/>
+              <w:start w:w="80" w:type="dxa"/>
               <w:bottom w:w="70" w:type="dxa"/>
-              <w:end w:w="100" w:type="dxa"/>
+              <w:end w:w="80" w:type="dxa"/>
             </w:tcMar>
             <w:tcBorders>
               <w:top w:val="nil"/>
@@ -1640,7 +1151,6 @@
               <w:bottom w:val="single" w:sz="4" w:color="D9D9D9"/>
               <w:right w:val="nil"/>
             </w:tcBorders>
-            <w:shd w:val="clear" w:color="auto" w:fill="F4F4F4"/>
           </w:tcPr>
           <w:p>
             <w:r>
@@ -1658,10 +1168,92 @@
     </w:tbl>
     <w:p>
       <w:pPr>
-        <w:spacing w:before="320" w:after="120"/>
-        <w:pBdr>
-          <w:bottom w:val="single" w:sz="12" w:space="4" w:color="B87548"/>
-        </w:pBdr>
+        <w:spacing w:before="80"/>
+      </w:pPr>
+      <w:r>
+        <w:rPr>
+          <w:rFonts w:ascii="Georgia" w:hAnsi="Georgia" w:eastAsia="Georgia"/>
+          <w:b w:val="0"/>
+          <w:i w:val="0"/>
+          <w:color w:val="2E7D5B"/>
+          <w:sz w:val="16"/>
+        </w:rPr>
+        <w:t>●</w:t>
+      </w:r>
+      <w:r>
+        <w:rPr>
+          <w:rFonts w:ascii="Georgia" w:hAnsi="Georgia" w:eastAsia="Georgia"/>
+          <w:b w:val="0"/>
+          <w:i w:val="0"/>
+          <w:color w:val="666666"/>
+          <w:sz w:val="16"/>
+        </w:rPr>
+        <w:t xml:space="preserve"> Atendido    </w:t>
+      </w:r>
+      <w:r>
+        <w:rPr>
+          <w:rFonts w:ascii="Georgia" w:hAnsi="Georgia" w:eastAsia="Georgia"/>
+          <w:b w:val="0"/>
+          <w:i w:val="0"/>
+          <w:color w:val="C98A0B"/>
+          <w:sz w:val="16"/>
+        </w:rPr>
+        <w:t>●</w:t>
+      </w:r>
+      <w:r>
+        <w:rPr>
+          <w:rFonts w:ascii="Georgia" w:hAnsi="Georgia" w:eastAsia="Georgia"/>
+          <w:b w:val="0"/>
+          <w:i w:val="0"/>
+          <w:color w:val="666666"/>
+          <w:sz w:val="16"/>
+        </w:rPr>
+        <w:t xml:space="preserve"> Alegado, não comprovado    </w:t>
+      </w:r>
+      <w:r>
+        <w:rPr>
+          <w:rFonts w:ascii="Georgia" w:hAnsi="Georgia" w:eastAsia="Georgia"/>
+          <w:b w:val="0"/>
+          <w:i w:val="0"/>
+          <w:color w:val="B3402F"/>
+          <w:sz w:val="16"/>
+        </w:rPr>
+        <w:t>●</w:t>
+      </w:r>
+      <w:r>
+        <w:rPr>
+          <w:rFonts w:ascii="Georgia" w:hAnsi="Georgia" w:eastAsia="Georgia"/>
+          <w:b w:val="0"/>
+          <w:i w:val="0"/>
+          <w:color w:val="666666"/>
+          <w:sz w:val="16"/>
+        </w:rPr>
+        <w:t xml:space="preserve"> Não encontrei nos autos    </w:t>
+      </w:r>
+      <w:r>
+        <w:rPr>
+          <w:rFonts w:ascii="Georgia" w:hAnsi="Georgia" w:eastAsia="Georgia"/>
+          <w:b w:val="0"/>
+          <w:i w:val="0"/>
+          <w:color w:val="5F7390"/>
+          <w:sz w:val="16"/>
+        </w:rPr>
+        <w:t>●</w:t>
+      </w:r>
+      <w:r>
+        <w:rPr>
+          <w:rFonts w:ascii="Georgia" w:hAnsi="Georgia" w:eastAsia="Georgia"/>
+          <w:b w:val="0"/>
+          <w:i w:val="0"/>
+          <w:color w:val="666666"/>
+          <w:sz w:val="16"/>
+        </w:rPr>
+        <w:t xml:space="preserve"> Dispensado    </w:t>
+      </w:r>
+    </w:p>
+    <w:p>
+      <w:pPr>
+        <w:spacing w:before="360" w:after="120"/>
       </w:pPr>
       <w:r>
         <w:rPr>
@@ -1669,9 +1261,9 @@
           <w:b/>
           <w:i w:val="0"/>
           <w:color w:val="064A45"/>
-          <w:sz w:val="25"/>
+          <w:sz w:val="24"/>
         </w:rPr>
-        <w:t>Tema 1234: competência e custeio</w:t>
+        <w:t>Tema 1234: competência</w:t>
       </w:r>
     </w:p>
     <w:tbl>
@@ -1681,26 +1273,53 @@
         <w:tblLayout w:type="fixed"/>
       </w:tblPr>
       <w:tblGrid>
-        <w:gridCol w:w="3118"/>
-        <w:gridCol w:w="3118"/>
-        <w:gridCol w:w="3118"/>
+        <w:gridCol w:w="4677"/>
+        <w:gridCol w:w="4677"/>
       </w:tblGrid>
       <w:tr>
         <w:tc>
           <w:tcPr>
-            <w:tcW w:type="dxa" w:w="2948"/>
-            <w:shd w:val="clear" w:color="auto" w:fill="F6EFE8"/>
+            <w:tcW w:type="dxa" w:w="3969"/>
             <w:tcMar>
-              <w:top w:w="140" w:type="dxa"/>
-              <w:start w:w="160" w:type="dxa"/>
-              <w:bottom w:w="140" w:type="dxa"/>
-              <w:end w:w="160" w:type="dxa"/>
+              <w:top w:w="50" w:type="dxa"/>
+              <w:start w:w="0" w:type="dxa"/>
+              <w:bottom w:w="50" w:type="dxa"/>
+              <w:end w:w="0" w:type="dxa"/>
             </w:tcMar>
             <w:tcBorders>
-              <w:top w:val="single" w:sz="24" w:color="B87548"/>
-              <w:left w:val="single" w:sz="36" w:color="FFFFFF"/>
-              <w:bottom w:val="nil"/>
-              <w:right w:val="single" w:sz="36" w:color="FFFFFF"/>
+              <w:top w:val="nil"/>
+              <w:left w:val="nil"/>
+              <w:bottom w:val="single" w:sz="4" w:color="D9D9D9"/>
+              <w:right w:val="nil"/>
+            </w:tcBorders>
+          </w:tcPr>
+          <w:p>
+            <w:r>
+              <w:rPr>
+                <w:rFonts w:ascii="Georgia" w:hAnsi="Georgia" w:eastAsia="Georgia"/>
+                <w:b w:val="0"/>
+                <w:i w:val="0"/>
+                <w:color w:val="666666"/>
+                <w:sz w:val="20"/>
+              </w:rPr>
+              <w:t>Valor anual do tratamento</w:t>
+            </w:r>
+          </w:p>
+        </w:tc>
+        <w:tc>
+          <w:tcPr>
+            <w:tcW w:type="dxa" w:w="5386"/>
+            <w:tcMar>
+              <w:top w:w="50" w:type="dxa"/>
+              <w:start w:w="0" w:type="dxa"/>
+              <w:bottom w:w="50" w:type="dxa"/>
+              <w:end w:w="0" w:type="dxa"/>
+            </w:tcMar>
+            <w:tcBorders>
+              <w:top w:val="nil"/>
+              <w:left w:val="nil"/>
+              <w:bottom w:val="single" w:sz="4" w:color="D9D9D9"/>
+              <w:right w:val="nil"/>
             </w:tcBorders>
           </w:tcPr>
           <w:p>
@@ -1709,40 +1328,57 @@
                 <w:rFonts w:ascii="Georgia" w:hAnsi="Georgia" w:eastAsia="Georgia"/>
                 <w:b/>
                 <w:i w:val="0"/>
-                <w:color w:val="B87548"/>
-                <w:sz w:val="16"/>
-              </w:rPr>
-              <w:t>VALOR ANUAL DO TRATAMENTO</w:t>
-            </w:r>
-          </w:p>
-          <w:p>
-            <w:r>
-              <w:rPr>
-                <w:rFonts w:ascii="Georgia" w:hAnsi="Georgia" w:eastAsia="Georgia"/>
-                <w:b/>
-                <w:i w:val="0"/>
-                <w:color w:val="064A45"/>
-                <w:sz w:val="28"/>
+                <w:sz w:val="21"/>
               </w:rPr>
               <w:t>R$ 148.320,00</w:t>
             </w:r>
           </w:p>
         </w:tc>
+      </w:tr>
+      <w:tr>
         <w:tc>
           <w:tcPr>
-            <w:tcW w:type="dxa" w:w="2948"/>
-            <w:shd w:val="clear" w:color="auto" w:fill="F6EFE8"/>
+            <w:tcW w:type="dxa" w:w="3969"/>
             <w:tcMar>
-              <w:top w:w="140" w:type="dxa"/>
-              <w:start w:w="160" w:type="dxa"/>
-              <w:bottom w:w="140" w:type="dxa"/>
-              <w:end w:w="160" w:type="dxa"/>
+              <w:top w:w="50" w:type="dxa"/>
+              <w:start w:w="0" w:type="dxa"/>
+              <w:bottom w:w="50" w:type="dxa"/>
+              <w:end w:w="0" w:type="dxa"/>
             </w:tcMar>
             <w:tcBorders>
-              <w:top w:val="single" w:sz="24" w:color="B87548"/>
-              <w:left w:val="single" w:sz="36" w:color="FFFFFF"/>
-              <w:bottom w:val="nil"/>
-              <w:right w:val="single" w:sz="36" w:color="FFFFFF"/>
+              <w:top w:val="nil"/>
+              <w:left w:val="nil"/>
+              <w:bottom w:val="single" w:sz="4" w:color="D9D9D9"/>
+              <w:right w:val="nil"/>
+            </w:tcBorders>
+          </w:tcPr>
+          <w:p>
+            <w:r>
+              <w:rPr>
+                <w:rFonts w:ascii="Georgia" w:hAnsi="Georgia" w:eastAsia="Georgia"/>
+                <w:b w:val="0"/>
+                <w:i w:val="0"/>
+                <w:color w:val="666666"/>
+                <w:sz w:val="20"/>
+              </w:rPr>
+              <w:t>210 salários mínimos</w:t>
+            </w:r>
+          </w:p>
+        </w:tc>
+        <w:tc>
+          <w:tcPr>
+            <w:tcW w:type="dxa" w:w="5386"/>
+            <w:tcMar>
+              <w:top w:w="50" w:type="dxa"/>
+              <w:start w:w="0" w:type="dxa"/>
+              <w:bottom w:w="50" w:type="dxa"/>
+              <w:end w:w="0" w:type="dxa"/>
+            </w:tcMar>
+            <w:tcBorders>
+              <w:top w:val="nil"/>
+              <w:left w:val="nil"/>
+              <w:bottom w:val="single" w:sz="4" w:color="D9D9D9"/>
+              <w:right w:val="nil"/>
             </w:tcBorders>
           </w:tcPr>
           <w:p>
@@ -1751,40 +1387,57 @@
                 <w:rFonts w:ascii="Georgia" w:hAnsi="Georgia" w:eastAsia="Georgia"/>
                 <w:b/>
                 <w:i w:val="0"/>
-                <w:color w:val="B87548"/>
-                <w:sz w:val="16"/>
-              </w:rPr>
-              <w:t>210 SALÁRIOS MÍNIMOS</w:t>
-            </w:r>
-          </w:p>
-          <w:p>
-            <w:r>
-              <w:rPr>
-                <w:rFonts w:ascii="Georgia" w:hAnsi="Georgia" w:eastAsia="Georgia"/>
-                <w:b/>
-                <w:i w:val="0"/>
-                <w:color w:val="064A45"/>
-                <w:sz w:val="28"/>
+                <w:sz w:val="21"/>
               </w:rPr>
               <w:t>R$ 340.410,00</w:t>
             </w:r>
           </w:p>
         </w:tc>
+      </w:tr>
+      <w:tr>
         <w:tc>
           <w:tcPr>
-            <w:tcW w:type="dxa" w:w="3458"/>
-            <w:shd w:val="clear" w:color="auto" w:fill="064A45"/>
+            <w:tcW w:type="dxa" w:w="3969"/>
             <w:tcMar>
-              <w:top w:w="140" w:type="dxa"/>
-              <w:start w:w="160" w:type="dxa"/>
-              <w:bottom w:w="140" w:type="dxa"/>
-              <w:end w:w="160" w:type="dxa"/>
+              <w:top w:w="50" w:type="dxa"/>
+              <w:start w:w="0" w:type="dxa"/>
+              <w:bottom w:w="50" w:type="dxa"/>
+              <w:end w:w="0" w:type="dxa"/>
             </w:tcMar>
             <w:tcBorders>
-              <w:top w:val="single" w:sz="24" w:color="B87548"/>
-              <w:left w:val="single" w:sz="36" w:color="FFFFFF"/>
-              <w:bottom w:val="nil"/>
-              <w:right w:val="single" w:sz="36" w:color="FFFFFF"/>
+              <w:top w:val="nil"/>
+              <w:left w:val="nil"/>
+              <w:bottom w:val="single" w:sz="4" w:color="D9D9D9"/>
+              <w:right w:val="nil"/>
+            </w:tcBorders>
+          </w:tcPr>
+          <w:p>
+            <w:r>
+              <w:rPr>
+                <w:rFonts w:ascii="Georgia" w:hAnsi="Georgia" w:eastAsia="Georgia"/>
+                <w:b w:val="0"/>
+                <w:i w:val="0"/>
+                <w:color w:val="666666"/>
+                <w:sz w:val="20"/>
+              </w:rPr>
+              <w:t>Onde tramita</w:t>
+            </w:r>
+          </w:p>
+        </w:tc>
+        <w:tc>
+          <w:tcPr>
+            <w:tcW w:type="dxa" w:w="5386"/>
+            <w:tcMar>
+              <w:top w:w="50" w:type="dxa"/>
+              <w:start w:w="0" w:type="dxa"/>
+              <w:bottom w:w="50" w:type="dxa"/>
+              <w:end w:w="0" w:type="dxa"/>
+            </w:tcMar>
+            <w:tcBorders>
+              <w:top w:val="nil"/>
+              <w:left w:val="nil"/>
+              <w:bottom w:val="single" w:sz="4" w:color="D9D9D9"/>
+              <w:right w:val="nil"/>
             </w:tcBorders>
           </w:tcPr>
           <w:p>
@@ -1793,20 +1446,7 @@
                 <w:rFonts w:ascii="Georgia" w:hAnsi="Georgia" w:eastAsia="Georgia"/>
                 <w:b/>
                 <w:i w:val="0"/>
-                <w:color w:val="E8C9A8"/>
-                <w:sz w:val="16"/>
-              </w:rPr>
-              <w:t>ONDE TRAMITA</w:t>
-            </w:r>
-          </w:p>
-          <w:p>
-            <w:r>
-              <w:rPr>
-                <w:rFonts w:ascii="Georgia" w:hAnsi="Georgia" w:eastAsia="Georgia"/>
-                <w:b/>
-                <w:i w:val="0"/>
-                <w:color w:val="FFFFFF"/>
-                <w:sz w:val="28"/>
+                <w:sz w:val="21"/>
               </w:rPr>
               <w:t>Justiça Estadual</w:t>
             </w:r>
@@ -1824,17 +1464,14 @@
           <w:b w:val="0"/>
           <w:i/>
           <w:color w:val="666666"/>
-          <w:sz w:val="19"/>
+          <w:sz w:val="18"/>
         </w:rPr>
         <w:t>Valores ilustrativos deste caso fictício. Na prática, use o PMVG (alíquota zero) da lista CMED e o salário mínimo vigente.</w:t>
       </w:r>
     </w:p>
     <w:p>
       <w:pPr>
-        <w:spacing w:before="320" w:after="120"/>
-        <w:pBdr>
-          <w:bottom w:val="single" w:sz="12" w:space="4" w:color="B87548"/>
-        </w:pBdr>
+        <w:spacing w:before="360" w:after="120"/>
       </w:pPr>
       <w:r>
         <w:rPr>
@@ -1842,97 +1479,71 @@
           <w:b/>
           <w:i w:val="0"/>
           <w:color w:val="064A45"/>
-          <w:sz w:val="25"/>
+          <w:sz w:val="24"/>
         </w:rPr>
         <w:t>Pontos para conferência humana</w:t>
       </w:r>
     </w:p>
-    <w:tbl>
-      <w:tblPr>
-        <w:tblLook w:firstColumn="1" w:firstRow="1" w:lastColumn="0" w:lastRow="0" w:noHBand="0" w:noVBand="1" w:val="04A0"/>
-        <w:tblW w:w="9355" w:type="dxa"/>
-        <w:tblLayout w:type="fixed"/>
-      </w:tblPr>
-      <w:tblGrid>
-        <w:gridCol w:w="9354"/>
-      </w:tblGrid>
-      <w:tr>
-        <w:tc>
-          <w:tcPr>
-            <w:tcW w:type="dxa" w:w="9354"/>
-            <w:shd w:val="clear" w:color="auto" w:fill="FBF3E4"/>
-            <w:tcMar>
-              <w:top w:w="140" w:type="dxa"/>
-              <w:start w:w="220" w:type="dxa"/>
-              <w:bottom w:w="140" w:type="dxa"/>
-              <w:end w:w="220" w:type="dxa"/>
-            </w:tcMar>
-            <w:tcBorders>
-              <w:top w:val="nil"/>
-              <w:left w:val="single" w:sz="36" w:color="C98A0B"/>
-              <w:bottom w:val="nil"/>
-              <w:right w:val="nil"/>
-            </w:tcBorders>
-          </w:tcPr>
-          <w:p>
-            <w:r>
-              <w:rPr>
-                <w:rFonts w:ascii="Georgia" w:hAnsi="Georgia" w:eastAsia="Georgia"/>
-                <w:b/>
-                <w:i w:val="0"/>
-                <w:color w:val="8A5A00"/>
-                <w:sz w:val="21"/>
-              </w:rPr>
-              <w:t>Antes de usar este relatório</w:t>
-            </w:r>
-          </w:p>
-          <w:p>
-            <w:r>
-              <w:rPr>
-                <w:rFonts w:ascii="Georgia" w:hAnsi="Georgia" w:eastAsia="Georgia"/>
-                <w:b w:val="0"/>
-                <w:i w:val="0"/>
-                <w:sz w:val="20"/>
-              </w:rPr>
-              <w:t>▪  Conferir nos autos se há ofício ou protocolo de pedido administrativo que não tenha sido anexado à inicial.</w:t>
-            </w:r>
-          </w:p>
-          <w:p>
-            <w:r>
-              <w:rPr>
-                <w:rFonts w:ascii="Georgia" w:hAnsi="Georgia" w:eastAsia="Georgia"/>
-                <w:b w:val="0"/>
-                <w:i w:val="0"/>
-                <w:sz w:val="20"/>
-              </w:rPr>
-              <w:t>▪  Conferir a lista da Conitec e as listas RENAME, RESME e REMUME na data da análise.</w:t>
-            </w:r>
-          </w:p>
-          <w:p>
-            <w:r>
-              <w:rPr>
-                <w:rFonts w:ascii="Georgia" w:hAnsi="Georgia" w:eastAsia="Georgia"/>
-                <w:b w:val="0"/>
-                <w:i w:val="0"/>
-                <w:sz w:val="20"/>
-              </w:rPr>
-              <w:t>▪  Conferir o valor anual do tratamento na lista CMED e o salário mínimo vigente.</w:t>
-            </w:r>
-          </w:p>
-          <w:p>
-            <w:r>
-              <w:rPr>
-                <w:rFonts w:ascii="Georgia" w:hAnsi="Georgia" w:eastAsia="Georgia"/>
-                <w:b w:val="0"/>
-                <w:i w:val="0"/>
-                <w:sz w:val="20"/>
-              </w:rPr>
-              <w:t>▪  Este relatório organiza a leitura; a decisão sobre a defesa é do procurador.</w:t>
-            </w:r>
-          </w:p>
-        </w:tc>
-      </w:tr>
-    </w:tbl>
+    <w:p>
+      <w:pPr>
+        <w:spacing w:after="60"/>
+        <w:ind w:left="283" w:hanging="283"/>
+      </w:pPr>
+      <w:r>
+        <w:rPr>
+          <w:rFonts w:ascii="Georgia" w:hAnsi="Georgia" w:eastAsia="Georgia"/>
+          <w:b w:val="0"/>
+          <w:i w:val="0"/>
+          <w:sz w:val="20"/>
+        </w:rPr>
+        <w:t>–  Conferir nos autos se há ofício ou protocolo de pedido administrativo que não tenha sido anexado à inicial.</w:t>
+      </w:r>
+    </w:p>
+    <w:p>
+      <w:pPr>
+        <w:spacing w:after="60"/>
+        <w:ind w:left="283" w:hanging="283"/>
+      </w:pPr>
+      <w:r>
+        <w:rPr>
+          <w:rFonts w:ascii="Georgia" w:hAnsi="Georgia" w:eastAsia="Georgia"/>
+          <w:b w:val="0"/>
+          <w:i w:val="0"/>
+          <w:sz w:val="20"/>
+        </w:rPr>
+        <w:t>–  Conferir a lista da Conitec e as listas RENAME, RESME e REMUME na data da análise.</w:t>
+      </w:r>
+    </w:p>
+    <w:p>
+      <w:pPr>
+        <w:spacing w:after="60"/>
+        <w:ind w:left="283" w:hanging="283"/>
+      </w:pPr>
+      <w:r>
+        <w:rPr>
+          <w:rFonts w:ascii="Georgia" w:hAnsi="Georgia" w:eastAsia="Georgia"/>
+          <w:b w:val="0"/>
+          <w:i w:val="0"/>
+          <w:sz w:val="20"/>
+        </w:rPr>
+        <w:t>–  Conferir o valor anual do tratamento na lista CMED e o salário mínimo vigente.</w:t>
+      </w:r>
+    </w:p>
+    <w:p>
+      <w:pPr>
+        <w:spacing w:after="60"/>
+        <w:ind w:left="283" w:hanging="283"/>
+      </w:pPr>
+      <w:r>
+        <w:rPr>
+          <w:rFonts w:ascii="Georgia" w:hAnsi="Georgia" w:eastAsia="Georgia"/>
+          <w:b w:val="0"/>
+          <w:i w:val="0"/>
+          <w:sz w:val="20"/>
+        </w:rPr>
+        <w:t>–  Este relatório organiza a leitura; a decisão sobre a defesa é do procurador.</w:t>
+      </w:r>
+    </w:p>
     <w:sectPr>
       <w:headerReference w:type="default" r:id="rId9"/>
       <w:footerReference w:type="default" r:id="rId10"/>
@@ -2010,13 +1621,13 @@
         <w:tab w:pos="9354" w:val="right"/>
       </w:tabs>
       <w:pBdr>
-        <w:bottom w:val="single" w:sz="12" w:space="4" w:color="B87548"/>
+        <w:bottom w:val="single" w:sz="6" w:space="6" w:color="B87548"/>
       </w:pBdr>
     </w:pPr>
     <w:r>
       <w:drawing>
         <wp:inline xmlns:a="http://schemas.openxmlformats.org/drawingml/2006/main" xmlns:pic="http://schemas.openxmlformats.org/drawingml/2006/picture">
-          <wp:extent cx="1915196" cy="503999"/>
+          <wp:extent cx="1778400" cy="468000"/>
           <wp:docPr id="1" name="Picture 1"/>
           <wp:cNvGraphicFramePr>
             <a:graphicFrameLocks noChangeAspect="1"/>
@@ -2037,7 +1648,7 @@
                 <pic:spPr>
                   <a:xfrm>
                     <a:off x="0" y="0"/>
-                    <a:ext cx="1915196" cy="503999"/>
+                    <a:ext cx="1778400" cy="468000"/>
                   </a:xfrm>
                   <a:prstGeom prst="rect"/>
                 </pic:spPr>
@@ -2053,7 +1664,7 @@
         <w:b w:val="0"/>
         <w:i w:val="0"/>
         <w:color w:val="666666"/>
-        <w:sz w:val="19"/>
+        <w:sz w:val="18"/>
       </w:rPr>
       <w:tab/>
       <w:tab/>

</xml_diff>